<commit_message>
documented Inserting values command(task03_1).
</commit_message>
<xml_diff>
--- a/Ems_FinalProject_86exyfme9/Submession.docx
+++ b/Ems_FinalProject_86exyfme9/Submession.docx
@@ -11176,11 +11176,1328 @@
     <w:p>
       <w:pPr>
         <w:spacing w:line="360" w:lineRule="auto"/>
-        <w:ind w:left="720"/>
-        <w:rPr>
-          <w:rFonts w:asciiTheme="majorBidi" w:hAnsiTheme="majorBidi" w:cstheme="majorBidi"/>
-          <w:i/>
-          <w:iCs/>
+        <w:rPr>
+          <w:rFonts w:asciiTheme="majorBidi" w:hAnsiTheme="majorBidi" w:cstheme="majorBidi"/>
+          <w:i/>
+          <w:iCs/>
+        </w:rPr>
+      </w:pPr>
+    </w:p>
+    <w:p>
+      <w:pPr>
+        <w:rPr>
+          <w:rFonts w:asciiTheme="majorBidi" w:hAnsiTheme="majorBidi" w:cstheme="majorBidi"/>
+          <w:b/>
+          <w:bCs/>
+          <w:sz w:val="32"/>
+          <w:szCs w:val="32"/>
+          <w:u w:val="single"/>
+        </w:rPr>
+      </w:pPr>
+      <w:r>
+        <w:rPr>
+          <w:rFonts w:asciiTheme="majorBidi" w:hAnsiTheme="majorBidi" w:cstheme="majorBidi"/>
+          <w:b/>
+          <w:bCs/>
+          <w:sz w:val="32"/>
+          <w:szCs w:val="32"/>
+          <w:u w:val="single"/>
+        </w:rPr>
+        <w:t>0</w:t>
+      </w:r>
+      <w:r>
+        <w:rPr>
+          <w:rFonts w:asciiTheme="majorBidi" w:hAnsiTheme="majorBidi" w:cstheme="majorBidi"/>
+          <w:b/>
+          <w:bCs/>
+          <w:sz w:val="32"/>
+          <w:szCs w:val="32"/>
+          <w:u w:val="single"/>
+        </w:rPr>
+        <w:t>3</w:t>
+      </w:r>
+      <w:r>
+        <w:rPr>
+          <w:rFonts w:asciiTheme="majorBidi" w:hAnsiTheme="majorBidi" w:cstheme="majorBidi"/>
+          <w:b/>
+          <w:bCs/>
+          <w:sz w:val="32"/>
+          <w:szCs w:val="32"/>
+          <w:u w:val="single"/>
+        </w:rPr>
+        <w:t xml:space="preserve"> </w:t>
+      </w:r>
+      <w:r>
+        <w:rPr>
+          <w:rFonts w:asciiTheme="majorBidi" w:hAnsiTheme="majorBidi" w:cstheme="majorBidi"/>
+          <w:b/>
+          <w:bCs/>
+          <w:sz w:val="32"/>
+          <w:szCs w:val="32"/>
+          <w:u w:val="single"/>
+        </w:rPr>
+        <w:t xml:space="preserve">SQL DML – INSERT/UPDATE / DELETE / SELECT </w:t>
+      </w:r>
+    </w:p>
+    <w:p>
+      <w:pPr>
+        <w:rPr>
+          <w:rFonts w:asciiTheme="majorBidi" w:hAnsiTheme="majorBidi" w:cstheme="majorBidi"/>
+          <w:sz w:val="28"/>
+          <w:szCs w:val="28"/>
+          <w:u w:val="single"/>
+        </w:rPr>
+      </w:pPr>
+      <w:r>
+        <w:rPr>
+          <w:rFonts w:asciiTheme="majorBidi" w:hAnsiTheme="majorBidi" w:cstheme="majorBidi"/>
+          <w:sz w:val="28"/>
+          <w:szCs w:val="28"/>
+          <w:u w:val="single"/>
+        </w:rPr>
+        <w:t>Task</w:t>
+      </w:r>
+      <w:r>
+        <w:rPr>
+          <w:rFonts w:asciiTheme="majorBidi" w:hAnsiTheme="majorBidi" w:cstheme="majorBidi"/>
+          <w:sz w:val="28"/>
+          <w:szCs w:val="28"/>
+          <w:u w:val="single"/>
+        </w:rPr>
+        <w:t>1</w:t>
+      </w:r>
+    </w:p>
+    <w:p>
+      <w:pPr>
+        <w:spacing w:line="240" w:lineRule="auto"/>
+        <w:rPr>
+          <w:rFonts w:asciiTheme="majorBidi" w:hAnsiTheme="majorBidi" w:cstheme="majorBidi"/>
+        </w:rPr>
+      </w:pPr>
+      <w:r>
+        <w:rPr>
+          <w:rFonts w:asciiTheme="majorBidi" w:hAnsiTheme="majorBidi" w:cstheme="majorBidi"/>
+        </w:rPr>
+        <w:t>This task populates all database tables with realistic seed data using Oracle sequences while preserving referential integrity</w:t>
+      </w:r>
+      <w:r>
+        <w:rPr>
+          <w:rFonts w:asciiTheme="majorBidi" w:hAnsiTheme="majorBidi" w:cstheme="majorBidi"/>
+        </w:rPr>
+        <w:t>.</w:t>
+      </w:r>
+    </w:p>
+    <w:p>
+      <w:pPr>
+        <w:spacing w:line="240" w:lineRule="auto"/>
+        <w:rPr>
+          <w:rFonts w:asciiTheme="majorBidi" w:hAnsiTheme="majorBidi" w:cstheme="majorBidi"/>
+        </w:rPr>
+      </w:pPr>
+      <w:r>
+        <w:rPr>
+          <w:rFonts w:asciiTheme="majorBidi" w:hAnsiTheme="majorBidi" w:cstheme="majorBidi"/>
+        </w:rPr>
+        <w:t xml:space="preserve">Seed data covers 5 zip locations, 5 salary records, 5 job departments, 5 qualifications, 10 employees, 10 emails, 5 leave records, and 8 payroll records, inserted in dependency order using sequence-generated keys. </w:t>
+      </w:r>
+    </w:p>
+    <w:p>
+      <w:pPr>
+        <w:spacing w:line="240" w:lineRule="auto"/>
+        <w:rPr>
+          <w:rFonts w:asciiTheme="majorBidi" w:hAnsiTheme="majorBidi" w:cstheme="majorBidi"/>
+        </w:rPr>
+      </w:pPr>
+      <w:r>
+        <w:rPr>
+          <w:rFonts w:asciiTheme="majorBidi" w:hAnsiTheme="majorBidi" w:cstheme="majorBidi"/>
+        </w:rPr>
+        <w:t>Example Queries</w:t>
+      </w:r>
+    </w:p>
+    <w:p>
+      <w:pPr>
+        <w:spacing w:line="240" w:lineRule="auto"/>
+        <w:ind w:left="720"/>
+        <w:rPr>
+          <w:rFonts w:asciiTheme="majorBidi" w:hAnsiTheme="majorBidi" w:cstheme="majorBidi"/>
+          <w:i/>
+          <w:iCs/>
+        </w:rPr>
+      </w:pPr>
+      <w:r>
+        <w:rPr>
+          <w:rFonts w:asciiTheme="majorBidi" w:hAnsiTheme="majorBidi" w:cstheme="majorBidi"/>
+          <w:i/>
+          <w:iCs/>
+        </w:rPr>
+        <w:t>INSERT INTO ZIP_LOCATIONS (</w:t>
+      </w:r>
+      <w:proofErr w:type="spellStart"/>
+      <w:r>
+        <w:rPr>
+          <w:rFonts w:asciiTheme="majorBidi" w:hAnsiTheme="majorBidi" w:cstheme="majorBidi"/>
+          <w:i/>
+          <w:iCs/>
+        </w:rPr>
+        <w:t>zip_code</w:t>
+      </w:r>
+      <w:proofErr w:type="spellEnd"/>
+      <w:r>
+        <w:rPr>
+          <w:rFonts w:asciiTheme="majorBidi" w:hAnsiTheme="majorBidi" w:cstheme="majorBidi"/>
+          <w:i/>
+          <w:iCs/>
+        </w:rPr>
+        <w:t xml:space="preserve">, city) VALUES ('100', 'Muscat'); </w:t>
+      </w:r>
+    </w:p>
+    <w:p>
+      <w:pPr>
+        <w:spacing w:line="240" w:lineRule="auto"/>
+        <w:ind w:left="720"/>
+        <w:rPr>
+          <w:rFonts w:asciiTheme="majorBidi" w:hAnsiTheme="majorBidi" w:cstheme="majorBidi"/>
+          <w:i/>
+          <w:iCs/>
+        </w:rPr>
+      </w:pPr>
+      <w:r>
+        <w:rPr>
+          <w:rFonts w:asciiTheme="majorBidi" w:hAnsiTheme="majorBidi" w:cstheme="majorBidi"/>
+          <w:i/>
+          <w:iCs/>
+        </w:rPr>
+        <w:t>INSERT INTO SALARY_BONUS (</w:t>
+      </w:r>
+      <w:proofErr w:type="spellStart"/>
+      <w:r>
+        <w:rPr>
+          <w:rFonts w:asciiTheme="majorBidi" w:hAnsiTheme="majorBidi" w:cstheme="majorBidi"/>
+          <w:i/>
+          <w:iCs/>
+        </w:rPr>
+        <w:t>salary_id</w:t>
+      </w:r>
+      <w:proofErr w:type="spellEnd"/>
+      <w:r>
+        <w:rPr>
+          <w:rFonts w:asciiTheme="majorBidi" w:hAnsiTheme="majorBidi" w:cstheme="majorBidi"/>
+          <w:i/>
+          <w:iCs/>
+        </w:rPr>
+        <w:t>, amount, annual, bons) VALUES (</w:t>
+      </w:r>
+      <w:proofErr w:type="spellStart"/>
+      <w:r>
+        <w:rPr>
+          <w:rFonts w:asciiTheme="majorBidi" w:hAnsiTheme="majorBidi" w:cstheme="majorBidi"/>
+          <w:i/>
+          <w:iCs/>
+        </w:rPr>
+        <w:t>seq_salary_</w:t>
+      </w:r>
+      <w:proofErr w:type="gramStart"/>
+      <w:r>
+        <w:rPr>
+          <w:rFonts w:asciiTheme="majorBidi" w:hAnsiTheme="majorBidi" w:cstheme="majorBidi"/>
+          <w:i/>
+          <w:iCs/>
+        </w:rPr>
+        <w:t>bonus.NEXTVAL</w:t>
+      </w:r>
+      <w:proofErr w:type="spellEnd"/>
+      <w:proofErr w:type="gramEnd"/>
+      <w:r>
+        <w:rPr>
+          <w:rFonts w:asciiTheme="majorBidi" w:hAnsiTheme="majorBidi" w:cstheme="majorBidi"/>
+          <w:i/>
+          <w:iCs/>
+        </w:rPr>
+        <w:t xml:space="preserve">, 1500, 18000, 500); </w:t>
+      </w:r>
+    </w:p>
+    <w:p>
+      <w:pPr>
+        <w:spacing w:line="240" w:lineRule="auto"/>
+        <w:ind w:left="720"/>
+        <w:rPr>
+          <w:rFonts w:asciiTheme="majorBidi" w:hAnsiTheme="majorBidi" w:cstheme="majorBidi"/>
+          <w:i/>
+          <w:iCs/>
+        </w:rPr>
+      </w:pPr>
+      <w:r>
+        <w:rPr>
+          <w:rFonts w:asciiTheme="majorBidi" w:hAnsiTheme="majorBidi" w:cstheme="majorBidi"/>
+          <w:i/>
+          <w:iCs/>
+        </w:rPr>
+        <w:t>INSERT INTO JOB_DEPARTMENT (</w:t>
+      </w:r>
+      <w:proofErr w:type="spellStart"/>
+      <w:r>
+        <w:rPr>
+          <w:rFonts w:asciiTheme="majorBidi" w:hAnsiTheme="majorBidi" w:cstheme="majorBidi"/>
+          <w:i/>
+          <w:iCs/>
+        </w:rPr>
+        <w:t>job_id</w:t>
+      </w:r>
+      <w:proofErr w:type="spellEnd"/>
+      <w:r>
+        <w:rPr>
+          <w:rFonts w:asciiTheme="majorBidi" w:hAnsiTheme="majorBidi" w:cstheme="majorBidi"/>
+          <w:i/>
+          <w:iCs/>
+        </w:rPr>
+        <w:t xml:space="preserve">, </w:t>
+      </w:r>
+      <w:proofErr w:type="spellStart"/>
+      <w:r>
+        <w:rPr>
+          <w:rFonts w:asciiTheme="majorBidi" w:hAnsiTheme="majorBidi" w:cstheme="majorBidi"/>
+          <w:i/>
+          <w:iCs/>
+        </w:rPr>
+        <w:t>job_Depar</w:t>
+      </w:r>
+      <w:proofErr w:type="spellEnd"/>
+      <w:r>
+        <w:rPr>
+          <w:rFonts w:asciiTheme="majorBidi" w:hAnsiTheme="majorBidi" w:cstheme="majorBidi"/>
+          <w:i/>
+          <w:iCs/>
+        </w:rPr>
+        <w:t xml:space="preserve">, name, Description, </w:t>
+      </w:r>
+      <w:proofErr w:type="spellStart"/>
+      <w:r>
+        <w:rPr>
+          <w:rFonts w:asciiTheme="majorBidi" w:hAnsiTheme="majorBidi" w:cstheme="majorBidi"/>
+          <w:i/>
+          <w:iCs/>
+        </w:rPr>
+        <w:t>MinS</w:t>
+      </w:r>
+      <w:proofErr w:type="spellEnd"/>
+      <w:r>
+        <w:rPr>
+          <w:rFonts w:asciiTheme="majorBidi" w:hAnsiTheme="majorBidi" w:cstheme="majorBidi"/>
+          <w:i/>
+          <w:iCs/>
+        </w:rPr>
+        <w:t xml:space="preserve">, </w:t>
+      </w:r>
+      <w:proofErr w:type="spellStart"/>
+      <w:r>
+        <w:rPr>
+          <w:rFonts w:asciiTheme="majorBidi" w:hAnsiTheme="majorBidi" w:cstheme="majorBidi"/>
+          <w:i/>
+          <w:iCs/>
+        </w:rPr>
+        <w:t>Max_S</w:t>
+      </w:r>
+      <w:proofErr w:type="spellEnd"/>
+      <w:r>
+        <w:rPr>
+          <w:rFonts w:asciiTheme="majorBidi" w:hAnsiTheme="majorBidi" w:cstheme="majorBidi"/>
+          <w:i/>
+          <w:iCs/>
+        </w:rPr>
+        <w:t xml:space="preserve">, </w:t>
+      </w:r>
+      <w:proofErr w:type="spellStart"/>
+      <w:r>
+        <w:rPr>
+          <w:rFonts w:asciiTheme="majorBidi" w:hAnsiTheme="majorBidi" w:cstheme="majorBidi"/>
+          <w:i/>
+          <w:iCs/>
+        </w:rPr>
+        <w:t>mgr_emp_id</w:t>
+      </w:r>
+      <w:proofErr w:type="spellEnd"/>
+      <w:r>
+        <w:rPr>
+          <w:rFonts w:asciiTheme="majorBidi" w:hAnsiTheme="majorBidi" w:cstheme="majorBidi"/>
+          <w:i/>
+          <w:iCs/>
+        </w:rPr>
+        <w:t>) VALUES (</w:t>
+      </w:r>
+      <w:proofErr w:type="spellStart"/>
+      <w:r>
+        <w:rPr>
+          <w:rFonts w:asciiTheme="majorBidi" w:hAnsiTheme="majorBidi" w:cstheme="majorBidi"/>
+          <w:i/>
+          <w:iCs/>
+        </w:rPr>
+        <w:t>seq_job_</w:t>
+      </w:r>
+      <w:proofErr w:type="gramStart"/>
+      <w:r>
+        <w:rPr>
+          <w:rFonts w:asciiTheme="majorBidi" w:hAnsiTheme="majorBidi" w:cstheme="majorBidi"/>
+          <w:i/>
+          <w:iCs/>
+        </w:rPr>
+        <w:t>department.NEXTVAL</w:t>
+      </w:r>
+      <w:proofErr w:type="spellEnd"/>
+      <w:proofErr w:type="gramEnd"/>
+      <w:r>
+        <w:rPr>
+          <w:rFonts w:asciiTheme="majorBidi" w:hAnsiTheme="majorBidi" w:cstheme="majorBidi"/>
+          <w:i/>
+          <w:iCs/>
+        </w:rPr>
+        <w:t>, 'Human Resources', 'HR Manager', 'Oversees recruitment, employee relations, and HR policy', 1200, 2200</w:t>
+      </w:r>
+      <w:r>
+        <w:rPr>
+          <w:rFonts w:asciiTheme="majorBidi" w:hAnsiTheme="majorBidi" w:cstheme="majorBidi"/>
+          <w:i/>
+          <w:iCs/>
+        </w:rPr>
+        <w:t>.</w:t>
+      </w:r>
+    </w:p>
+    <w:p>
+      <w:pPr>
+        <w:spacing w:line="240" w:lineRule="auto"/>
+        <w:rPr>
+          <w:rFonts w:asciiTheme="majorBidi" w:hAnsiTheme="majorBidi" w:cstheme="majorBidi"/>
+        </w:rPr>
+      </w:pPr>
+      <w:r>
+        <w:rPr>
+          <w:rFonts w:asciiTheme="majorBidi" w:hAnsiTheme="majorBidi" w:cstheme="majorBidi"/>
+        </w:rPr>
+        <w:lastRenderedPageBreak/>
+        <w:drawing>
+          <wp:inline distT="0" distB="0" distL="0" distR="0" wp14:anchorId="79A1A6A0" wp14:editId="2B65B18E">
+            <wp:extent cx="5433081" cy="2460978"/>
+            <wp:effectExtent l="76200" t="76200" r="129540" b="130175"/>
+            <wp:docPr id="68054767" name="Picture 1"/>
+            <wp:cNvGraphicFramePr>
+              <a:graphicFrameLocks xmlns:a="http://schemas.openxmlformats.org/drawingml/2006/main" noChangeAspect="1"/>
+            </wp:cNvGraphicFramePr>
+            <a:graphic xmlns:a="http://schemas.openxmlformats.org/drawingml/2006/main">
+              <a:graphicData uri="http://schemas.openxmlformats.org/drawingml/2006/picture">
+                <pic:pic xmlns:pic="http://schemas.openxmlformats.org/drawingml/2006/picture">
+                  <pic:nvPicPr>
+                    <pic:cNvPr id="68054767" name=""/>
+                    <pic:cNvPicPr/>
+                  </pic:nvPicPr>
+                  <pic:blipFill>
+                    <a:blip r:embed="rId7"/>
+                    <a:stretch>
+                      <a:fillRect/>
+                    </a:stretch>
+                  </pic:blipFill>
+                  <pic:spPr>
+                    <a:xfrm>
+                      <a:off x="0" y="0"/>
+                      <a:ext cx="5463123" cy="2474586"/>
+                    </a:xfrm>
+                    <a:prstGeom prst="rect">
+                      <a:avLst/>
+                    </a:prstGeom>
+                    <a:ln w="38100" cap="sq">
+                      <a:solidFill>
+                        <a:srgbClr val="000000"/>
+                      </a:solidFill>
+                      <a:prstDash val="solid"/>
+                      <a:miter lim="800000"/>
+                    </a:ln>
+                    <a:effectLst>
+                      <a:outerShdw blurRad="50800" dist="38100" dir="2700000" algn="tl" rotWithShape="0">
+                        <a:srgbClr val="000000">
+                          <a:alpha val="43000"/>
+                        </a:srgbClr>
+                      </a:outerShdw>
+                    </a:effectLst>
+                  </pic:spPr>
+                </pic:pic>
+              </a:graphicData>
+            </a:graphic>
+          </wp:inline>
+        </w:drawing>
+      </w:r>
+    </w:p>
+    <w:p>
+      <w:pPr>
+        <w:spacing w:line="240" w:lineRule="auto"/>
+        <w:ind w:left="720"/>
+        <w:rPr>
+          <w:rFonts w:asciiTheme="majorBidi" w:hAnsiTheme="majorBidi" w:cstheme="majorBidi"/>
+        </w:rPr>
+      </w:pPr>
+      <w:r>
+        <w:rPr>
+          <w:rFonts w:asciiTheme="majorBidi" w:hAnsiTheme="majorBidi" w:cstheme="majorBidi"/>
+        </w:rPr>
+        <w:t xml:space="preserve">EMP_EMAIL table in </w:t>
+      </w:r>
+      <w:proofErr w:type="spellStart"/>
+      <w:r>
+        <w:rPr>
+          <w:rFonts w:asciiTheme="majorBidi" w:hAnsiTheme="majorBidi" w:cstheme="majorBidi"/>
+        </w:rPr>
+        <w:t>Sql</w:t>
+      </w:r>
+      <w:proofErr w:type="spellEnd"/>
+      <w:r>
+        <w:rPr>
+          <w:rFonts w:asciiTheme="majorBidi" w:hAnsiTheme="majorBidi" w:cstheme="majorBidi"/>
+        </w:rPr>
+        <w:t xml:space="preserve"> developer.</w:t>
+      </w:r>
+    </w:p>
+    <w:p>
+      <w:pPr>
+        <w:spacing w:line="240" w:lineRule="auto"/>
+        <w:ind w:left="720"/>
+        <w:rPr>
+          <w:rFonts w:asciiTheme="majorBidi" w:hAnsiTheme="majorBidi" w:cstheme="majorBidi"/>
+        </w:rPr>
+      </w:pPr>
+    </w:p>
+    <w:p>
+      <w:pPr>
+        <w:spacing w:line="240" w:lineRule="auto"/>
+        <w:rPr>
+          <w:rFonts w:asciiTheme="majorBidi" w:hAnsiTheme="majorBidi" w:cstheme="majorBidi"/>
+        </w:rPr>
+      </w:pPr>
+      <w:r>
+        <w:rPr>
+          <w:rFonts w:asciiTheme="majorBidi" w:hAnsiTheme="majorBidi" w:cstheme="majorBidi"/>
+        </w:rPr>
+        <w:drawing>
+          <wp:inline distT="0" distB="0" distL="0" distR="0" wp14:anchorId="34E941C8" wp14:editId="60D723D0">
+            <wp:extent cx="5952067" cy="1744269"/>
+            <wp:effectExtent l="76200" t="76200" r="125095" b="142240"/>
+            <wp:docPr id="178129673" name="Picture 1"/>
+            <wp:cNvGraphicFramePr>
+              <a:graphicFrameLocks xmlns:a="http://schemas.openxmlformats.org/drawingml/2006/main" noChangeAspect="1"/>
+            </wp:cNvGraphicFramePr>
+            <a:graphic xmlns:a="http://schemas.openxmlformats.org/drawingml/2006/main">
+              <a:graphicData uri="http://schemas.openxmlformats.org/drawingml/2006/picture">
+                <pic:pic xmlns:pic="http://schemas.openxmlformats.org/drawingml/2006/picture">
+                  <pic:nvPicPr>
+                    <pic:cNvPr id="178129673" name=""/>
+                    <pic:cNvPicPr/>
+                  </pic:nvPicPr>
+                  <pic:blipFill>
+                    <a:blip r:embed="rId8"/>
+                    <a:stretch>
+                      <a:fillRect/>
+                    </a:stretch>
+                  </pic:blipFill>
+                  <pic:spPr>
+                    <a:xfrm>
+                      <a:off x="0" y="0"/>
+                      <a:ext cx="6000774" cy="1758543"/>
+                    </a:xfrm>
+                    <a:prstGeom prst="rect">
+                      <a:avLst/>
+                    </a:prstGeom>
+                    <a:ln w="38100" cap="sq">
+                      <a:solidFill>
+                        <a:srgbClr val="000000"/>
+                      </a:solidFill>
+                      <a:prstDash val="solid"/>
+                      <a:miter lim="800000"/>
+                    </a:ln>
+                    <a:effectLst>
+                      <a:outerShdw blurRad="50800" dist="38100" dir="2700000" algn="tl" rotWithShape="0">
+                        <a:srgbClr val="000000">
+                          <a:alpha val="43000"/>
+                        </a:srgbClr>
+                      </a:outerShdw>
+                    </a:effectLst>
+                  </pic:spPr>
+                </pic:pic>
+              </a:graphicData>
+            </a:graphic>
+          </wp:inline>
+        </w:drawing>
+      </w:r>
+    </w:p>
+    <w:p>
+      <w:pPr>
+        <w:spacing w:line="240" w:lineRule="auto"/>
+        <w:ind w:left="720"/>
+        <w:rPr>
+          <w:rFonts w:asciiTheme="majorBidi" w:hAnsiTheme="majorBidi" w:cstheme="majorBidi"/>
+        </w:rPr>
+      </w:pPr>
+      <w:r>
+        <w:rPr>
+          <w:rFonts w:asciiTheme="majorBidi" w:hAnsiTheme="majorBidi" w:cstheme="majorBidi"/>
+        </w:rPr>
+        <w:t>EM</w:t>
+      </w:r>
+      <w:r>
+        <w:rPr>
+          <w:rFonts w:asciiTheme="majorBidi" w:hAnsiTheme="majorBidi" w:cstheme="majorBidi"/>
+        </w:rPr>
+        <w:t>P</w:t>
+      </w:r>
+      <w:r>
+        <w:rPr>
+          <w:rFonts w:asciiTheme="majorBidi" w:hAnsiTheme="majorBidi" w:cstheme="majorBidi"/>
+        </w:rPr>
+        <w:t>L</w:t>
+      </w:r>
+      <w:r>
+        <w:rPr>
+          <w:rFonts w:asciiTheme="majorBidi" w:hAnsiTheme="majorBidi" w:cstheme="majorBidi"/>
+        </w:rPr>
+        <w:t>OYEE</w:t>
+      </w:r>
+      <w:r>
+        <w:rPr>
+          <w:rFonts w:asciiTheme="majorBidi" w:hAnsiTheme="majorBidi" w:cstheme="majorBidi"/>
+        </w:rPr>
+        <w:t xml:space="preserve"> table in </w:t>
+      </w:r>
+      <w:proofErr w:type="spellStart"/>
+      <w:r>
+        <w:rPr>
+          <w:rFonts w:asciiTheme="majorBidi" w:hAnsiTheme="majorBidi" w:cstheme="majorBidi"/>
+        </w:rPr>
+        <w:t>Sql</w:t>
+      </w:r>
+      <w:proofErr w:type="spellEnd"/>
+      <w:r>
+        <w:rPr>
+          <w:rFonts w:asciiTheme="majorBidi" w:hAnsiTheme="majorBidi" w:cstheme="majorBidi"/>
+        </w:rPr>
+        <w:t xml:space="preserve"> developer.</w:t>
+      </w:r>
+    </w:p>
+    <w:p>
+      <w:pPr>
+        <w:spacing w:line="240" w:lineRule="auto"/>
+        <w:rPr>
+          <w:rFonts w:asciiTheme="majorBidi" w:hAnsiTheme="majorBidi" w:cstheme="majorBidi"/>
+        </w:rPr>
+      </w:pPr>
+      <w:r>
+        <w:rPr>
+          <w:rFonts w:asciiTheme="majorBidi" w:hAnsiTheme="majorBidi" w:cstheme="majorBidi"/>
+        </w:rPr>
+        <w:tab/>
+      </w:r>
+      <w:r>
+        <w:rPr>
+          <w:rFonts w:asciiTheme="majorBidi" w:hAnsiTheme="majorBidi" w:cstheme="majorBidi"/>
+        </w:rPr>
+        <w:drawing>
+          <wp:inline distT="0" distB="0" distL="0" distR="0" wp14:anchorId="332F9DDA" wp14:editId="5F0B7A35">
+            <wp:extent cx="5974644" cy="1444625"/>
+            <wp:effectExtent l="76200" t="76200" r="140970" b="136525"/>
+            <wp:docPr id="642860069" name="Picture 1"/>
+            <wp:cNvGraphicFramePr>
+              <a:graphicFrameLocks xmlns:a="http://schemas.openxmlformats.org/drawingml/2006/main" noChangeAspect="1"/>
+            </wp:cNvGraphicFramePr>
+            <a:graphic xmlns:a="http://schemas.openxmlformats.org/drawingml/2006/main">
+              <a:graphicData uri="http://schemas.openxmlformats.org/drawingml/2006/picture">
+                <pic:pic xmlns:pic="http://schemas.openxmlformats.org/drawingml/2006/picture">
+                  <pic:nvPicPr>
+                    <pic:cNvPr id="642860069" name=""/>
+                    <pic:cNvPicPr/>
+                  </pic:nvPicPr>
+                  <pic:blipFill>
+                    <a:blip r:embed="rId9"/>
+                    <a:stretch>
+                      <a:fillRect/>
+                    </a:stretch>
+                  </pic:blipFill>
+                  <pic:spPr>
+                    <a:xfrm>
+                      <a:off x="0" y="0"/>
+                      <a:ext cx="6021171" cy="1455875"/>
+                    </a:xfrm>
+                    <a:prstGeom prst="rect">
+                      <a:avLst/>
+                    </a:prstGeom>
+                    <a:ln w="38100" cap="sq">
+                      <a:solidFill>
+                        <a:srgbClr val="000000"/>
+                      </a:solidFill>
+                      <a:prstDash val="solid"/>
+                      <a:miter lim="800000"/>
+                    </a:ln>
+                    <a:effectLst>
+                      <a:outerShdw blurRad="50800" dist="38100" dir="2700000" algn="tl" rotWithShape="0">
+                        <a:srgbClr val="000000">
+                          <a:alpha val="43000"/>
+                        </a:srgbClr>
+                      </a:outerShdw>
+                    </a:effectLst>
+                  </pic:spPr>
+                </pic:pic>
+              </a:graphicData>
+            </a:graphic>
+          </wp:inline>
+        </w:drawing>
+      </w:r>
+    </w:p>
+    <w:p>
+      <w:pPr>
+        <w:spacing w:line="240" w:lineRule="auto"/>
+        <w:ind w:firstLine="720"/>
+        <w:rPr>
+          <w:rFonts w:asciiTheme="majorBidi" w:hAnsiTheme="majorBidi" w:cstheme="majorBidi"/>
+        </w:rPr>
+      </w:pPr>
+      <w:proofErr w:type="spellStart"/>
+      <w:r>
+        <w:rPr>
+          <w:rFonts w:asciiTheme="majorBidi" w:hAnsiTheme="majorBidi" w:cstheme="majorBidi"/>
+        </w:rPr>
+        <w:t>JOP_Department</w:t>
+      </w:r>
+      <w:proofErr w:type="spellEnd"/>
+      <w:r>
+        <w:rPr>
+          <w:rFonts w:asciiTheme="majorBidi" w:hAnsiTheme="majorBidi" w:cstheme="majorBidi"/>
+        </w:rPr>
+        <w:t xml:space="preserve"> table in </w:t>
+      </w:r>
+      <w:proofErr w:type="spellStart"/>
+      <w:r>
+        <w:rPr>
+          <w:rFonts w:asciiTheme="majorBidi" w:hAnsiTheme="majorBidi" w:cstheme="majorBidi"/>
+        </w:rPr>
+        <w:t>Sql</w:t>
+      </w:r>
+      <w:proofErr w:type="spellEnd"/>
+      <w:r>
+        <w:rPr>
+          <w:rFonts w:asciiTheme="majorBidi" w:hAnsiTheme="majorBidi" w:cstheme="majorBidi"/>
+        </w:rPr>
+        <w:t xml:space="preserve"> developer.</w:t>
+      </w:r>
+    </w:p>
+    <w:p>
+      <w:pPr>
+        <w:spacing w:line="240" w:lineRule="auto"/>
+        <w:rPr>
+          <w:rFonts w:asciiTheme="majorBidi" w:hAnsiTheme="majorBidi" w:cstheme="majorBidi"/>
+        </w:rPr>
+      </w:pPr>
+      <w:r>
+        <w:rPr>
+          <w:rFonts w:asciiTheme="majorBidi" w:hAnsiTheme="majorBidi" w:cstheme="majorBidi"/>
+        </w:rPr>
+        <w:lastRenderedPageBreak/>
+        <w:drawing>
+          <wp:inline distT="0" distB="0" distL="0" distR="0" wp14:anchorId="55973EB5" wp14:editId="291F5903">
+            <wp:extent cx="4210756" cy="1574520"/>
+            <wp:effectExtent l="76200" t="76200" r="132715" b="140335"/>
+            <wp:docPr id="1725166608" name="Picture 1"/>
+            <wp:cNvGraphicFramePr>
+              <a:graphicFrameLocks xmlns:a="http://schemas.openxmlformats.org/drawingml/2006/main" noChangeAspect="1"/>
+            </wp:cNvGraphicFramePr>
+            <a:graphic xmlns:a="http://schemas.openxmlformats.org/drawingml/2006/main">
+              <a:graphicData uri="http://schemas.openxmlformats.org/drawingml/2006/picture">
+                <pic:pic xmlns:pic="http://schemas.openxmlformats.org/drawingml/2006/picture">
+                  <pic:nvPicPr>
+                    <pic:cNvPr id="1725166608" name=""/>
+                    <pic:cNvPicPr/>
+                  </pic:nvPicPr>
+                  <pic:blipFill>
+                    <a:blip r:embed="rId10"/>
+                    <a:stretch>
+                      <a:fillRect/>
+                    </a:stretch>
+                  </pic:blipFill>
+                  <pic:spPr>
+                    <a:xfrm>
+                      <a:off x="0" y="0"/>
+                      <a:ext cx="4220273" cy="1578079"/>
+                    </a:xfrm>
+                    <a:prstGeom prst="rect">
+                      <a:avLst/>
+                    </a:prstGeom>
+                    <a:ln w="38100" cap="sq">
+                      <a:solidFill>
+                        <a:srgbClr val="000000"/>
+                      </a:solidFill>
+                      <a:prstDash val="solid"/>
+                      <a:miter lim="800000"/>
+                    </a:ln>
+                    <a:effectLst>
+                      <a:outerShdw blurRad="50800" dist="38100" dir="2700000" algn="tl" rotWithShape="0">
+                        <a:srgbClr val="000000">
+                          <a:alpha val="43000"/>
+                        </a:srgbClr>
+                      </a:outerShdw>
+                    </a:effectLst>
+                  </pic:spPr>
+                </pic:pic>
+              </a:graphicData>
+            </a:graphic>
+          </wp:inline>
+        </w:drawing>
+      </w:r>
+    </w:p>
+    <w:p>
+      <w:pPr>
+        <w:spacing w:line="240" w:lineRule="auto"/>
+        <w:ind w:firstLine="720"/>
+        <w:rPr>
+          <w:rFonts w:asciiTheme="majorBidi" w:hAnsiTheme="majorBidi" w:cstheme="majorBidi"/>
+        </w:rPr>
+      </w:pPr>
+      <w:r>
+        <w:rPr>
+          <w:rFonts w:asciiTheme="majorBidi" w:hAnsiTheme="majorBidi" w:cstheme="majorBidi"/>
+        </w:rPr>
+        <w:t>LEAVEE</w:t>
+      </w:r>
+      <w:r>
+        <w:rPr>
+          <w:rFonts w:asciiTheme="majorBidi" w:hAnsiTheme="majorBidi" w:cstheme="majorBidi"/>
+        </w:rPr>
+        <w:t xml:space="preserve"> table in </w:t>
+      </w:r>
+      <w:proofErr w:type="spellStart"/>
+      <w:r>
+        <w:rPr>
+          <w:rFonts w:asciiTheme="majorBidi" w:hAnsiTheme="majorBidi" w:cstheme="majorBidi"/>
+        </w:rPr>
+        <w:t>Sql</w:t>
+      </w:r>
+      <w:proofErr w:type="spellEnd"/>
+      <w:r>
+        <w:rPr>
+          <w:rFonts w:asciiTheme="majorBidi" w:hAnsiTheme="majorBidi" w:cstheme="majorBidi"/>
+        </w:rPr>
+        <w:t xml:space="preserve"> developer.</w:t>
+      </w:r>
+    </w:p>
+    <w:p>
+      <w:pPr>
+        <w:spacing w:line="240" w:lineRule="auto"/>
+        <w:rPr>
+          <w:rFonts w:asciiTheme="majorBidi" w:hAnsiTheme="majorBidi" w:cstheme="majorBidi"/>
+        </w:rPr>
+      </w:pPr>
+      <w:r>
+        <w:rPr>
+          <w:rFonts w:asciiTheme="majorBidi" w:hAnsiTheme="majorBidi" w:cstheme="majorBidi"/>
+        </w:rPr>
+        <w:drawing>
+          <wp:inline distT="0" distB="0" distL="0" distR="0" wp14:anchorId="7DC4A54A" wp14:editId="5A621C8A">
+            <wp:extent cx="5943600" cy="1604645"/>
+            <wp:effectExtent l="76200" t="76200" r="133350" b="128905"/>
+            <wp:docPr id="1045026622" name="Picture 1"/>
+            <wp:cNvGraphicFramePr>
+              <a:graphicFrameLocks xmlns:a="http://schemas.openxmlformats.org/drawingml/2006/main" noChangeAspect="1"/>
+            </wp:cNvGraphicFramePr>
+            <a:graphic xmlns:a="http://schemas.openxmlformats.org/drawingml/2006/main">
+              <a:graphicData uri="http://schemas.openxmlformats.org/drawingml/2006/picture">
+                <pic:pic xmlns:pic="http://schemas.openxmlformats.org/drawingml/2006/picture">
+                  <pic:nvPicPr>
+                    <pic:cNvPr id="1045026622" name=""/>
+                    <pic:cNvPicPr/>
+                  </pic:nvPicPr>
+                  <pic:blipFill>
+                    <a:blip r:embed="rId11"/>
+                    <a:stretch>
+                      <a:fillRect/>
+                    </a:stretch>
+                  </pic:blipFill>
+                  <pic:spPr>
+                    <a:xfrm>
+                      <a:off x="0" y="0"/>
+                      <a:ext cx="5943600" cy="1604645"/>
+                    </a:xfrm>
+                    <a:prstGeom prst="rect">
+                      <a:avLst/>
+                    </a:prstGeom>
+                    <a:ln w="38100" cap="sq">
+                      <a:solidFill>
+                        <a:srgbClr val="000000"/>
+                      </a:solidFill>
+                      <a:prstDash val="solid"/>
+                      <a:miter lim="800000"/>
+                    </a:ln>
+                    <a:effectLst>
+                      <a:outerShdw blurRad="50800" dist="38100" dir="2700000" algn="tl" rotWithShape="0">
+                        <a:srgbClr val="000000">
+                          <a:alpha val="43000"/>
+                        </a:srgbClr>
+                      </a:outerShdw>
+                    </a:effectLst>
+                  </pic:spPr>
+                </pic:pic>
+              </a:graphicData>
+            </a:graphic>
+          </wp:inline>
+        </w:drawing>
+      </w:r>
+    </w:p>
+    <w:p>
+      <w:pPr>
+        <w:spacing w:line="240" w:lineRule="auto"/>
+        <w:ind w:firstLine="720"/>
+        <w:rPr>
+          <w:rFonts w:asciiTheme="majorBidi" w:hAnsiTheme="majorBidi" w:cstheme="majorBidi"/>
+        </w:rPr>
+      </w:pPr>
+      <w:r>
+        <w:rPr>
+          <w:rFonts w:asciiTheme="majorBidi" w:hAnsiTheme="majorBidi" w:cstheme="majorBidi"/>
+        </w:rPr>
+        <w:t>PAYROLL</w:t>
+      </w:r>
+      <w:r>
+        <w:rPr>
+          <w:rFonts w:asciiTheme="majorBidi" w:hAnsiTheme="majorBidi" w:cstheme="majorBidi"/>
+        </w:rPr>
+        <w:t xml:space="preserve"> table in </w:t>
+      </w:r>
+      <w:proofErr w:type="spellStart"/>
+      <w:r>
+        <w:rPr>
+          <w:rFonts w:asciiTheme="majorBidi" w:hAnsiTheme="majorBidi" w:cstheme="majorBidi"/>
+        </w:rPr>
+        <w:t>Sql</w:t>
+      </w:r>
+      <w:proofErr w:type="spellEnd"/>
+      <w:r>
+        <w:rPr>
+          <w:rFonts w:asciiTheme="majorBidi" w:hAnsiTheme="majorBidi" w:cstheme="majorBidi"/>
+        </w:rPr>
+        <w:t xml:space="preserve"> developer.</w:t>
+      </w:r>
+    </w:p>
+    <w:p>
+      <w:pPr>
+        <w:spacing w:line="240" w:lineRule="auto"/>
+        <w:rPr>
+          <w:rFonts w:asciiTheme="majorBidi" w:hAnsiTheme="majorBidi" w:cstheme="majorBidi"/>
+        </w:rPr>
+      </w:pPr>
+      <w:r>
+        <w:rPr>
+          <w:rFonts w:asciiTheme="majorBidi" w:hAnsiTheme="majorBidi" w:cstheme="majorBidi"/>
+        </w:rPr>
+        <w:drawing>
+          <wp:inline distT="0" distB="0" distL="0" distR="0" wp14:anchorId="7CAB1487" wp14:editId="3EB2F45D">
+            <wp:extent cx="6302766" cy="1343378"/>
+            <wp:effectExtent l="76200" t="76200" r="136525" b="142875"/>
+            <wp:docPr id="1295485409" name="Picture 1"/>
+            <wp:cNvGraphicFramePr>
+              <a:graphicFrameLocks xmlns:a="http://schemas.openxmlformats.org/drawingml/2006/main" noChangeAspect="1"/>
+            </wp:cNvGraphicFramePr>
+            <a:graphic xmlns:a="http://schemas.openxmlformats.org/drawingml/2006/main">
+              <a:graphicData uri="http://schemas.openxmlformats.org/drawingml/2006/picture">
+                <pic:pic xmlns:pic="http://schemas.openxmlformats.org/drawingml/2006/picture">
+                  <pic:nvPicPr>
+                    <pic:cNvPr id="1295485409" name=""/>
+                    <pic:cNvPicPr/>
+                  </pic:nvPicPr>
+                  <pic:blipFill>
+                    <a:blip r:embed="rId12"/>
+                    <a:stretch>
+                      <a:fillRect/>
+                    </a:stretch>
+                  </pic:blipFill>
+                  <pic:spPr>
+                    <a:xfrm>
+                      <a:off x="0" y="0"/>
+                      <a:ext cx="6341000" cy="1351527"/>
+                    </a:xfrm>
+                    <a:prstGeom prst="rect">
+                      <a:avLst/>
+                    </a:prstGeom>
+                    <a:ln w="38100" cap="sq">
+                      <a:solidFill>
+                        <a:srgbClr val="000000"/>
+                      </a:solidFill>
+                      <a:prstDash val="solid"/>
+                      <a:miter lim="800000"/>
+                    </a:ln>
+                    <a:effectLst>
+                      <a:outerShdw blurRad="50800" dist="38100" dir="2700000" algn="tl" rotWithShape="0">
+                        <a:srgbClr val="000000">
+                          <a:alpha val="43000"/>
+                        </a:srgbClr>
+                      </a:outerShdw>
+                    </a:effectLst>
+                  </pic:spPr>
+                </pic:pic>
+              </a:graphicData>
+            </a:graphic>
+          </wp:inline>
+        </w:drawing>
+      </w:r>
+    </w:p>
+    <w:p>
+      <w:pPr>
+        <w:spacing w:line="240" w:lineRule="auto"/>
+        <w:ind w:firstLine="720"/>
+        <w:rPr>
+          <w:rFonts w:asciiTheme="majorBidi" w:hAnsiTheme="majorBidi" w:cstheme="majorBidi"/>
+        </w:rPr>
+      </w:pPr>
+      <w:r>
+        <w:rPr>
+          <w:rFonts w:asciiTheme="majorBidi" w:hAnsiTheme="majorBidi" w:cstheme="majorBidi"/>
+        </w:rPr>
+        <w:t>QUALIFICATION</w:t>
+      </w:r>
+      <w:r>
+        <w:rPr>
+          <w:rFonts w:asciiTheme="majorBidi" w:hAnsiTheme="majorBidi" w:cstheme="majorBidi"/>
+        </w:rPr>
+        <w:t xml:space="preserve"> table in </w:t>
+      </w:r>
+      <w:proofErr w:type="spellStart"/>
+      <w:r>
+        <w:rPr>
+          <w:rFonts w:asciiTheme="majorBidi" w:hAnsiTheme="majorBidi" w:cstheme="majorBidi"/>
+        </w:rPr>
+        <w:t>Sql</w:t>
+      </w:r>
+      <w:proofErr w:type="spellEnd"/>
+      <w:r>
+        <w:rPr>
+          <w:rFonts w:asciiTheme="majorBidi" w:hAnsiTheme="majorBidi" w:cstheme="majorBidi"/>
+        </w:rPr>
+        <w:t xml:space="preserve"> developer.</w:t>
+      </w:r>
+    </w:p>
+    <w:p>
+      <w:pPr>
+        <w:spacing w:line="240" w:lineRule="auto"/>
+        <w:ind w:firstLine="720"/>
+        <w:rPr>
+          <w:rFonts w:asciiTheme="majorBidi" w:hAnsiTheme="majorBidi" w:cstheme="majorBidi"/>
+        </w:rPr>
+      </w:pPr>
+      <w:r>
+        <w:rPr>
+          <w:rFonts w:asciiTheme="majorBidi" w:hAnsiTheme="majorBidi" w:cstheme="majorBidi"/>
+        </w:rPr>
+        <w:lastRenderedPageBreak/>
+        <w:drawing>
+          <wp:inline distT="0" distB="0" distL="0" distR="0" wp14:anchorId="16F9EB19" wp14:editId="534725A8">
+            <wp:extent cx="5191126" cy="2077156"/>
+            <wp:effectExtent l="76200" t="76200" r="123825" b="132715"/>
+            <wp:docPr id="838745170" name="Picture 1"/>
+            <wp:cNvGraphicFramePr>
+              <a:graphicFrameLocks xmlns:a="http://schemas.openxmlformats.org/drawingml/2006/main" noChangeAspect="1"/>
+            </wp:cNvGraphicFramePr>
+            <a:graphic xmlns:a="http://schemas.openxmlformats.org/drawingml/2006/main">
+              <a:graphicData uri="http://schemas.openxmlformats.org/drawingml/2006/picture">
+                <pic:pic xmlns:pic="http://schemas.openxmlformats.org/drawingml/2006/picture">
+                  <pic:nvPicPr>
+                    <pic:cNvPr id="838745170" name=""/>
+                    <pic:cNvPicPr/>
+                  </pic:nvPicPr>
+                  <pic:blipFill>
+                    <a:blip r:embed="rId13"/>
+                    <a:stretch>
+                      <a:fillRect/>
+                    </a:stretch>
+                  </pic:blipFill>
+                  <pic:spPr>
+                    <a:xfrm>
+                      <a:off x="0" y="0"/>
+                      <a:ext cx="5196134" cy="2079160"/>
+                    </a:xfrm>
+                    <a:prstGeom prst="rect">
+                      <a:avLst/>
+                    </a:prstGeom>
+                    <a:ln w="38100" cap="sq">
+                      <a:solidFill>
+                        <a:srgbClr val="000000"/>
+                      </a:solidFill>
+                      <a:prstDash val="solid"/>
+                      <a:miter lim="800000"/>
+                    </a:ln>
+                    <a:effectLst>
+                      <a:outerShdw blurRad="50800" dist="38100" dir="2700000" algn="tl" rotWithShape="0">
+                        <a:srgbClr val="000000">
+                          <a:alpha val="43000"/>
+                        </a:srgbClr>
+                      </a:outerShdw>
+                    </a:effectLst>
+                  </pic:spPr>
+                </pic:pic>
+              </a:graphicData>
+            </a:graphic>
+          </wp:inline>
+        </w:drawing>
+      </w:r>
+    </w:p>
+    <w:p>
+      <w:pPr>
+        <w:spacing w:line="240" w:lineRule="auto"/>
+        <w:ind w:firstLine="720"/>
+        <w:rPr>
+          <w:rFonts w:asciiTheme="majorBidi" w:hAnsiTheme="majorBidi" w:cstheme="majorBidi"/>
+        </w:rPr>
+      </w:pPr>
+      <w:r>
+        <w:rPr>
+          <w:rFonts w:asciiTheme="majorBidi" w:hAnsiTheme="majorBidi" w:cstheme="majorBidi"/>
+        </w:rPr>
+        <w:t>SALARY_BONUS</w:t>
+      </w:r>
+      <w:r>
+        <w:rPr>
+          <w:rFonts w:asciiTheme="majorBidi" w:hAnsiTheme="majorBidi" w:cstheme="majorBidi"/>
+        </w:rPr>
+        <w:t xml:space="preserve"> table in </w:t>
+      </w:r>
+      <w:proofErr w:type="spellStart"/>
+      <w:r>
+        <w:rPr>
+          <w:rFonts w:asciiTheme="majorBidi" w:hAnsiTheme="majorBidi" w:cstheme="majorBidi"/>
+        </w:rPr>
+        <w:t>Sql</w:t>
+      </w:r>
+      <w:proofErr w:type="spellEnd"/>
+      <w:r>
+        <w:rPr>
+          <w:rFonts w:asciiTheme="majorBidi" w:hAnsiTheme="majorBidi" w:cstheme="majorBidi"/>
+        </w:rPr>
+        <w:t xml:space="preserve"> developer.</w:t>
+      </w:r>
+    </w:p>
+    <w:p>
+      <w:pPr>
+        <w:spacing w:line="240" w:lineRule="auto"/>
+        <w:ind w:firstLine="720"/>
+        <w:rPr>
+          <w:rFonts w:asciiTheme="majorBidi" w:hAnsiTheme="majorBidi" w:cstheme="majorBidi"/>
+        </w:rPr>
+      </w:pPr>
+      <w:r>
+        <w:rPr>
+          <w:rFonts w:asciiTheme="majorBidi" w:hAnsiTheme="majorBidi" w:cstheme="majorBidi"/>
+        </w:rPr>
+        <w:drawing>
+          <wp:inline distT="0" distB="0" distL="0" distR="0" wp14:anchorId="77ED36D1" wp14:editId="20E7397F">
+            <wp:extent cx="3772426" cy="2000529"/>
+            <wp:effectExtent l="76200" t="76200" r="133350" b="133350"/>
+            <wp:docPr id="734097420" name="Picture 1"/>
+            <wp:cNvGraphicFramePr>
+              <a:graphicFrameLocks xmlns:a="http://schemas.openxmlformats.org/drawingml/2006/main" noChangeAspect="1"/>
+            </wp:cNvGraphicFramePr>
+            <a:graphic xmlns:a="http://schemas.openxmlformats.org/drawingml/2006/main">
+              <a:graphicData uri="http://schemas.openxmlformats.org/drawingml/2006/picture">
+                <pic:pic xmlns:pic="http://schemas.openxmlformats.org/drawingml/2006/picture">
+                  <pic:nvPicPr>
+                    <pic:cNvPr id="734097420" name=""/>
+                    <pic:cNvPicPr/>
+                  </pic:nvPicPr>
+                  <pic:blipFill>
+                    <a:blip r:embed="rId14"/>
+                    <a:stretch>
+                      <a:fillRect/>
+                    </a:stretch>
+                  </pic:blipFill>
+                  <pic:spPr>
+                    <a:xfrm>
+                      <a:off x="0" y="0"/>
+                      <a:ext cx="3772426" cy="2000529"/>
+                    </a:xfrm>
+                    <a:prstGeom prst="rect">
+                      <a:avLst/>
+                    </a:prstGeom>
+                    <a:ln w="38100" cap="sq">
+                      <a:solidFill>
+                        <a:srgbClr val="000000"/>
+                      </a:solidFill>
+                      <a:prstDash val="solid"/>
+                      <a:miter lim="800000"/>
+                    </a:ln>
+                    <a:effectLst>
+                      <a:outerShdw blurRad="50800" dist="38100" dir="2700000" algn="tl" rotWithShape="0">
+                        <a:srgbClr val="000000">
+                          <a:alpha val="43000"/>
+                        </a:srgbClr>
+                      </a:outerShdw>
+                    </a:effectLst>
+                  </pic:spPr>
+                </pic:pic>
+              </a:graphicData>
+            </a:graphic>
+          </wp:inline>
+        </w:drawing>
+      </w:r>
+    </w:p>
+    <w:p>
+      <w:pPr>
+        <w:spacing w:line="240" w:lineRule="auto"/>
+        <w:ind w:firstLine="720"/>
+        <w:rPr>
+          <w:rFonts w:asciiTheme="majorBidi" w:hAnsiTheme="majorBidi" w:cstheme="majorBidi"/>
+        </w:rPr>
+      </w:pPr>
+      <w:r>
+        <w:rPr>
+          <w:rFonts w:asciiTheme="majorBidi" w:hAnsiTheme="majorBidi" w:cstheme="majorBidi"/>
+        </w:rPr>
+        <w:t>ZIP_LOCATION</w:t>
+      </w:r>
+      <w:r>
+        <w:rPr>
+          <w:rFonts w:asciiTheme="majorBidi" w:hAnsiTheme="majorBidi" w:cstheme="majorBidi"/>
+        </w:rPr>
+        <w:t xml:space="preserve"> table in </w:t>
+      </w:r>
+      <w:proofErr w:type="spellStart"/>
+      <w:r>
+        <w:rPr>
+          <w:rFonts w:asciiTheme="majorBidi" w:hAnsiTheme="majorBidi" w:cstheme="majorBidi"/>
+        </w:rPr>
+        <w:t>Sql</w:t>
+      </w:r>
+      <w:proofErr w:type="spellEnd"/>
+      <w:r>
+        <w:rPr>
+          <w:rFonts w:asciiTheme="majorBidi" w:hAnsiTheme="majorBidi" w:cstheme="majorBidi"/>
+        </w:rPr>
+        <w:t xml:space="preserve"> developer.</w:t>
+      </w:r>
+    </w:p>
+    <w:p>
+      <w:pPr>
+        <w:spacing w:line="240" w:lineRule="auto"/>
+        <w:ind w:firstLine="720"/>
+        <w:rPr>
+          <w:rFonts w:asciiTheme="majorBidi" w:hAnsiTheme="majorBidi" w:cstheme="majorBidi"/>
+        </w:rPr>
+      </w:pPr>
+    </w:p>
+    <w:p>
+      <w:pPr>
+        <w:spacing w:line="240" w:lineRule="auto"/>
+        <w:rPr>
+          <w:rFonts w:asciiTheme="majorBidi" w:hAnsiTheme="majorBidi" w:cstheme="majorBidi"/>
+        </w:rPr>
+      </w:pPr>
+      <w:r>
+        <w:rPr>
+          <w:rFonts w:asciiTheme="majorBidi" w:hAnsiTheme="majorBidi" w:cstheme="majorBidi"/>
+        </w:rPr>
+        <w:tab/>
+      </w:r>
+    </w:p>
+    <w:p>
+      <w:pPr>
+        <w:rPr>
+          <w:rFonts w:asciiTheme="majorBidi" w:hAnsiTheme="majorBidi" w:cstheme="majorBidi"/>
+          <w:sz w:val="28"/>
+          <w:szCs w:val="28"/>
+          <w:u w:val="single"/>
+        </w:rPr>
+      </w:pPr>
+      <w:r>
+        <w:rPr>
+          <w:rFonts w:asciiTheme="majorBidi" w:hAnsiTheme="majorBidi" w:cstheme="majorBidi"/>
+          <w:sz w:val="28"/>
+          <w:szCs w:val="28"/>
+          <w:u w:val="single"/>
+        </w:rPr>
+        <w:t>Task</w:t>
+      </w:r>
+      <w:r>
+        <w:rPr>
+          <w:rFonts w:asciiTheme="majorBidi" w:hAnsiTheme="majorBidi" w:cstheme="majorBidi"/>
+          <w:sz w:val="28"/>
+          <w:szCs w:val="28"/>
+          <w:u w:val="single"/>
+        </w:rPr>
+        <w:t>2</w:t>
+      </w:r>
+    </w:p>
+    <w:p>
+      <w:pPr>
+        <w:rPr>
+          <w:rFonts w:asciiTheme="majorBidi" w:hAnsiTheme="majorBidi" w:cstheme="majorBidi"/>
+          <w:sz w:val="28"/>
+          <w:szCs w:val="28"/>
+          <w:u w:val="single"/>
+        </w:rPr>
+      </w:pPr>
+    </w:p>
+    <w:p>
+      <w:pPr>
+        <w:rPr>
+          <w:rFonts w:asciiTheme="majorBidi" w:hAnsiTheme="majorBidi" w:cstheme="majorBidi"/>
+          <w:sz w:val="28"/>
+          <w:szCs w:val="28"/>
+          <w:u w:val="single"/>
+        </w:rPr>
+      </w:pPr>
+    </w:p>
+    <w:p>
+      <w:pPr>
+        <w:rPr>
+          <w:rFonts w:asciiTheme="majorBidi" w:hAnsiTheme="majorBidi" w:cstheme="majorBidi"/>
+          <w:sz w:val="28"/>
+          <w:szCs w:val="28"/>
+          <w:u w:val="single"/>
+        </w:rPr>
+      </w:pPr>
+      <w:r>
+        <w:rPr>
+          <w:rFonts w:asciiTheme="majorBidi" w:hAnsiTheme="majorBidi" w:cstheme="majorBidi"/>
+          <w:sz w:val="28"/>
+          <w:szCs w:val="28"/>
+          <w:u w:val="single"/>
+        </w:rPr>
+        <w:t>Task</w:t>
+      </w:r>
+      <w:r>
+        <w:rPr>
+          <w:rFonts w:asciiTheme="majorBidi" w:hAnsiTheme="majorBidi" w:cstheme="majorBidi"/>
+          <w:sz w:val="28"/>
+          <w:szCs w:val="28"/>
+          <w:u w:val="single"/>
+        </w:rPr>
+        <w:t>3</w:t>
+      </w:r>
+    </w:p>
+    <w:p>
+      <w:pPr>
+        <w:rPr>
+          <w:rFonts w:asciiTheme="majorBidi" w:hAnsiTheme="majorBidi" w:cstheme="majorBidi"/>
+          <w:sz w:val="28"/>
+          <w:szCs w:val="28"/>
+          <w:u w:val="single"/>
+        </w:rPr>
+      </w:pPr>
+    </w:p>
+    <w:p>
+      <w:pPr>
+        <w:rPr>
+          <w:rFonts w:asciiTheme="majorBidi" w:hAnsiTheme="majorBidi" w:cstheme="majorBidi"/>
+          <w:b/>
+          <w:bCs/>
+          <w:sz w:val="32"/>
+          <w:szCs w:val="32"/>
+          <w:u w:val="single"/>
+        </w:rPr>
+      </w:pPr>
+    </w:p>
+    <w:p>
+      <w:pPr>
+        <w:spacing w:line="360" w:lineRule="auto"/>
+        <w:rPr>
+          <w:rFonts w:asciiTheme="majorBidi" w:hAnsiTheme="majorBidi" w:cstheme="majorBidi"/>
         </w:rPr>
       </w:pPr>
     </w:p>
@@ -11855,7 +13172,7 @@
   <w:style w:type="paragraph" w:default="1" w:styleId="Normal">
     <w:name w:val="Normal"/>
     <w:qFormat/>
-    <w:rsid w:val="00974B49"/>
+    <w:rsid w:val="0047417A"/>
   </w:style>
   <w:style w:type="paragraph" w:styleId="Heading1">
     <w:name w:val="heading 1"/>

</xml_diff>

<commit_message>
added task 05-5 to the document
</commit_message>
<xml_diff>
--- a/Ems_FinalProject_86exyfme9/Submession.docx
+++ b/Ems_FinalProject_86exyfme9/Submession.docx
@@ -16843,24 +16843,26 @@
           <w:u w:val="single"/>
         </w:rPr>
       </w:pPr>
-      <w:r>
+    </w:p>
+    <w:p>
+      <w:pPr>
         <w:rPr>
           <w:rFonts w:asciiTheme="majorBidi" w:hAnsiTheme="majorBidi" w:cstheme="majorBidi"/>
           <w:sz w:val="28"/>
           <w:szCs w:val="28"/>
           <w:u w:val="single"/>
         </w:rPr>
-        <w:t>Task</w:t>
-      </w:r>
-      <w:r>
+      </w:pPr>
+    </w:p>
+    <w:p>
+      <w:pPr>
         <w:rPr>
           <w:rFonts w:asciiTheme="majorBidi" w:hAnsiTheme="majorBidi" w:cstheme="majorBidi"/>
           <w:sz w:val="28"/>
           <w:szCs w:val="28"/>
           <w:u w:val="single"/>
         </w:rPr>
-        <w:t>5</w:t>
-      </w:r>
+      </w:pPr>
     </w:p>
     <w:p>
       <w:pPr>
@@ -16878,7 +16880,779 @@
           <w:rFonts w:asciiTheme="majorBidi" w:hAnsiTheme="majorBidi" w:cstheme="majorBidi"/>
           <w:sz w:val="28"/>
           <w:szCs w:val="28"/>
-        </w:rPr>
+          <w:u w:val="single"/>
+        </w:rPr>
+      </w:pPr>
+    </w:p>
+    <w:p>
+      <w:pPr>
+        <w:rPr>
+          <w:rFonts w:asciiTheme="majorBidi" w:hAnsiTheme="majorBidi" w:cstheme="majorBidi"/>
+          <w:sz w:val="28"/>
+          <w:szCs w:val="28"/>
+          <w:u w:val="single"/>
+        </w:rPr>
+      </w:pPr>
+    </w:p>
+    <w:p>
+      <w:pPr>
+        <w:rPr>
+          <w:rFonts w:asciiTheme="majorBidi" w:hAnsiTheme="majorBidi" w:cstheme="majorBidi"/>
+          <w:sz w:val="28"/>
+          <w:szCs w:val="28"/>
+          <w:u w:val="single"/>
+        </w:rPr>
+      </w:pPr>
+    </w:p>
+    <w:p>
+      <w:pPr>
+        <w:rPr>
+          <w:rFonts w:asciiTheme="majorBidi" w:hAnsiTheme="majorBidi" w:cstheme="majorBidi"/>
+          <w:sz w:val="28"/>
+          <w:szCs w:val="28"/>
+          <w:u w:val="single"/>
+        </w:rPr>
+      </w:pPr>
+    </w:p>
+    <w:p>
+      <w:pPr>
+        <w:rPr>
+          <w:rFonts w:asciiTheme="majorBidi" w:hAnsiTheme="majorBidi" w:cstheme="majorBidi"/>
+          <w:sz w:val="28"/>
+          <w:szCs w:val="28"/>
+          <w:u w:val="single"/>
+        </w:rPr>
+      </w:pPr>
+    </w:p>
+    <w:p>
+      <w:pPr>
+        <w:rPr>
+          <w:rFonts w:asciiTheme="majorBidi" w:hAnsiTheme="majorBidi" w:cstheme="majorBidi"/>
+          <w:sz w:val="28"/>
+          <w:szCs w:val="28"/>
+          <w:u w:val="single"/>
+        </w:rPr>
+      </w:pPr>
+    </w:p>
+    <w:p>
+      <w:pPr>
+        <w:rPr>
+          <w:rFonts w:asciiTheme="majorBidi" w:hAnsiTheme="majorBidi" w:cstheme="majorBidi"/>
+          <w:sz w:val="28"/>
+          <w:szCs w:val="28"/>
+          <w:u w:val="single"/>
+        </w:rPr>
+      </w:pPr>
+    </w:p>
+    <w:p>
+      <w:pPr>
+        <w:rPr>
+          <w:rFonts w:asciiTheme="majorBidi" w:hAnsiTheme="majorBidi" w:cstheme="majorBidi"/>
+          <w:sz w:val="28"/>
+          <w:szCs w:val="28"/>
+          <w:u w:val="single"/>
+        </w:rPr>
+      </w:pPr>
+    </w:p>
+    <w:p>
+      <w:pPr>
+        <w:rPr>
+          <w:rFonts w:asciiTheme="majorBidi" w:hAnsiTheme="majorBidi" w:cstheme="majorBidi"/>
+          <w:sz w:val="28"/>
+          <w:szCs w:val="28"/>
+          <w:u w:val="single"/>
+        </w:rPr>
+      </w:pPr>
+    </w:p>
+    <w:p>
+      <w:pPr>
+        <w:rPr>
+          <w:rFonts w:asciiTheme="majorBidi" w:hAnsiTheme="majorBidi" w:cstheme="majorBidi"/>
+          <w:sz w:val="28"/>
+          <w:szCs w:val="28"/>
+          <w:u w:val="single"/>
+        </w:rPr>
+      </w:pPr>
+      <w:r>
+        <w:rPr>
+          <w:rFonts w:asciiTheme="majorBidi" w:hAnsiTheme="majorBidi" w:cstheme="majorBidi"/>
+          <w:sz w:val="28"/>
+          <w:szCs w:val="28"/>
+          <w:u w:val="single"/>
+        </w:rPr>
+        <w:lastRenderedPageBreak/>
+        <w:t>Task</w:t>
+      </w:r>
+      <w:r>
+        <w:rPr>
+          <w:rFonts w:asciiTheme="majorBidi" w:hAnsiTheme="majorBidi" w:cstheme="majorBidi"/>
+          <w:sz w:val="28"/>
+          <w:szCs w:val="28"/>
+          <w:u w:val="single"/>
+        </w:rPr>
+        <w:t>5</w:t>
+      </w:r>
+    </w:p>
+    <w:p>
+      <w:pPr>
+        <w:spacing w:line="240" w:lineRule="auto"/>
+        <w:rPr>
+          <w:rFonts w:asciiTheme="majorBidi" w:hAnsiTheme="majorBidi" w:cstheme="majorBidi"/>
+        </w:rPr>
+      </w:pPr>
+      <w:r>
+        <w:rPr>
+          <w:rFonts w:asciiTheme="majorBidi" w:hAnsiTheme="majorBidi" w:cstheme="majorBidi"/>
+        </w:rPr>
+        <w:t xml:space="preserve">I use </w:t>
+      </w:r>
+      <w:proofErr w:type="gramStart"/>
+      <w:r>
+        <w:rPr>
+          <w:rFonts w:asciiTheme="majorBidi" w:hAnsiTheme="majorBidi" w:cstheme="majorBidi"/>
+        </w:rPr>
+        <w:t>a CROSS</w:t>
+      </w:r>
+      <w:proofErr w:type="gramEnd"/>
+      <w:r>
+        <w:rPr>
+          <w:rFonts w:asciiTheme="majorBidi" w:hAnsiTheme="majorBidi" w:cstheme="majorBidi"/>
+        </w:rPr>
+        <w:t xml:space="preserve"> JOIN to list employee-department pairings the employee doesn't currently hold, then apply UNION, INTERSECT, and MINUS to compare PAYROLL and LEAVEE participation across employees.</w:t>
+      </w:r>
+    </w:p>
+    <w:p>
+      <w:pPr>
+        <w:spacing w:line="240" w:lineRule="auto"/>
+        <w:rPr>
+          <w:rFonts w:asciiTheme="majorBidi" w:hAnsiTheme="majorBidi" w:cstheme="majorBidi"/>
+          <w:b/>
+          <w:bCs/>
+        </w:rPr>
+      </w:pPr>
+      <w:r>
+        <w:rPr>
+          <w:rFonts w:asciiTheme="majorBidi" w:hAnsiTheme="majorBidi" w:cstheme="majorBidi"/>
+          <w:b/>
+          <w:bCs/>
+        </w:rPr>
+        <w:t>(a</w:t>
+      </w:r>
+      <w:r>
+        <w:rPr>
+          <w:rFonts w:asciiTheme="majorBidi" w:hAnsiTheme="majorBidi" w:cstheme="majorBidi"/>
+          <w:b/>
+          <w:bCs/>
+        </w:rPr>
+        <w:t xml:space="preserve">) </w:t>
+      </w:r>
+      <w:r>
+        <w:rPr>
+          <w:rFonts w:asciiTheme="majorBidi" w:hAnsiTheme="majorBidi" w:cstheme="majorBidi"/>
+          <w:b/>
+          <w:bCs/>
+        </w:rPr>
+        <w:t>Employee/department pairings outside current assignment</w:t>
+      </w:r>
+    </w:p>
+    <w:p/>
+    <w:p>
+      <w:r>
+        <w:drawing>
+          <wp:inline distT="0" distB="0" distL="0" distR="0" wp14:anchorId="386D4374" wp14:editId="767E2520">
+            <wp:extent cx="4124960" cy="5858249"/>
+            <wp:effectExtent l="0" t="0" r="8890" b="9525"/>
+            <wp:docPr id="1504054596" name="Picture 1"/>
+            <wp:cNvGraphicFramePr>
+              <a:graphicFrameLocks xmlns:a="http://schemas.openxmlformats.org/drawingml/2006/main" noChangeAspect="1"/>
+            </wp:cNvGraphicFramePr>
+            <a:graphic xmlns:a="http://schemas.openxmlformats.org/drawingml/2006/main">
+              <a:graphicData uri="http://schemas.openxmlformats.org/drawingml/2006/picture">
+                <pic:pic xmlns:pic="http://schemas.openxmlformats.org/drawingml/2006/picture">
+                  <pic:nvPicPr>
+                    <pic:cNvPr id="1504054596" name=""/>
+                    <pic:cNvPicPr/>
+                  </pic:nvPicPr>
+                  <pic:blipFill rotWithShape="1">
+                    <a:blip r:embed="rId35"/>
+                    <a:srcRect r="18350" b="11393"/>
+                    <a:stretch>
+                      <a:fillRect/>
+                    </a:stretch>
+                  </pic:blipFill>
+                  <pic:spPr bwMode="auto">
+                    <a:xfrm>
+                      <a:off x="0" y="0"/>
+                      <a:ext cx="4129705" cy="5864987"/>
+                    </a:xfrm>
+                    <a:prstGeom prst="rect">
+                      <a:avLst/>
+                    </a:prstGeom>
+                    <a:ln>
+                      <a:noFill/>
+                    </a:ln>
+                    <a:extLst>
+                      <a:ext uri="{53640926-AAD7-44D8-BBD7-CCE9431645EC}">
+                        <a14:shadowObscured xmlns:a14="http://schemas.microsoft.com/office/drawing/2010/main"/>
+                      </a:ext>
+                    </a:extLst>
+                  </pic:spPr>
+                </pic:pic>
+              </a:graphicData>
+            </a:graphic>
+          </wp:inline>
+        </w:drawing>
+      </w:r>
+    </w:p>
+    <w:p/>
+    <w:p/>
+    <w:p>
+      <w:pPr>
+        <w:rPr>
+          <w:b/>
+          <w:bCs/>
+        </w:rPr>
+      </w:pPr>
+      <w:r>
+        <w:rPr>
+          <w:b/>
+          <w:bCs/>
+        </w:rPr>
+        <w:lastRenderedPageBreak/>
+        <w:t>(b) Set operations on PAYROLL vs LEAVEE participation</w:t>
+      </w:r>
+    </w:p>
+    <w:p>
+      <w:pPr>
+        <w:spacing w:line="240" w:lineRule="auto"/>
+        <w:ind w:left="720"/>
+        <w:rPr>
+          <w:i/>
+          <w:iCs/>
+        </w:rPr>
+      </w:pPr>
+      <w:r>
+        <w:rPr>
+          <w:i/>
+          <w:iCs/>
+        </w:rPr>
+        <w:t>-- UNION: every employee who has either a payroll record, a leave record,</w:t>
+      </w:r>
+    </w:p>
+    <w:p>
+      <w:pPr>
+        <w:spacing w:line="240" w:lineRule="auto"/>
+        <w:ind w:left="720"/>
+        <w:rPr>
+          <w:i/>
+          <w:iCs/>
+        </w:rPr>
+      </w:pPr>
+      <w:r>
+        <w:rPr>
+          <w:i/>
+          <w:iCs/>
+        </w:rPr>
+        <w:t>-- or both -- essentially everyone with any payroll/HR activity at all.</w:t>
+      </w:r>
+    </w:p>
+    <w:p>
+      <w:pPr>
+        <w:spacing w:line="240" w:lineRule="auto"/>
+        <w:ind w:left="720"/>
+        <w:rPr>
+          <w:i/>
+          <w:iCs/>
+        </w:rPr>
+      </w:pPr>
+    </w:p>
+    <w:p>
+      <w:pPr>
+        <w:spacing w:line="240" w:lineRule="auto"/>
+        <w:ind w:left="720"/>
+        <w:rPr>
+          <w:i/>
+          <w:iCs/>
+        </w:rPr>
+      </w:pPr>
+      <w:r>
+        <w:rPr>
+          <w:i/>
+          <w:iCs/>
+        </w:rPr>
+        <w:t xml:space="preserve">SELECT </w:t>
+      </w:r>
+      <w:proofErr w:type="spellStart"/>
+      <w:r>
+        <w:rPr>
+          <w:i/>
+          <w:iCs/>
+        </w:rPr>
+        <w:t>emp_id</w:t>
+      </w:r>
+      <w:proofErr w:type="spellEnd"/>
+      <w:r>
+        <w:rPr>
+          <w:i/>
+          <w:iCs/>
+        </w:rPr>
+        <w:t xml:space="preserve"> FROM PAYROLL</w:t>
+      </w:r>
+    </w:p>
+    <w:p>
+      <w:pPr>
+        <w:spacing w:line="240" w:lineRule="auto"/>
+        <w:ind w:left="720"/>
+        <w:rPr>
+          <w:i/>
+          <w:iCs/>
+        </w:rPr>
+      </w:pPr>
+      <w:r>
+        <w:rPr>
+          <w:i/>
+          <w:iCs/>
+        </w:rPr>
+        <w:t>UNION</w:t>
+      </w:r>
+    </w:p>
+    <w:p>
+      <w:pPr>
+        <w:spacing w:line="240" w:lineRule="auto"/>
+        <w:ind w:left="720"/>
+        <w:rPr>
+          <w:i/>
+          <w:iCs/>
+        </w:rPr>
+      </w:pPr>
+      <w:r>
+        <w:rPr>
+          <w:i/>
+          <w:iCs/>
+        </w:rPr>
+        <w:t xml:space="preserve">SELECT </w:t>
+      </w:r>
+      <w:proofErr w:type="spellStart"/>
+      <w:r>
+        <w:rPr>
+          <w:i/>
+          <w:iCs/>
+        </w:rPr>
+        <w:t>emp_id</w:t>
+      </w:r>
+      <w:proofErr w:type="spellEnd"/>
+      <w:r>
+        <w:rPr>
+          <w:i/>
+          <w:iCs/>
+        </w:rPr>
+        <w:t xml:space="preserve"> FROM LEAVEE;</w:t>
+      </w:r>
+    </w:p>
+    <w:p>
+      <w:pPr>
+        <w:spacing w:line="240" w:lineRule="auto"/>
+        <w:ind w:left="720"/>
+        <w:rPr>
+          <w:i/>
+          <w:iCs/>
+        </w:rPr>
+      </w:pPr>
+    </w:p>
+    <w:p>
+      <w:pPr>
+        <w:spacing w:line="240" w:lineRule="auto"/>
+        <w:ind w:left="720"/>
+        <w:rPr>
+          <w:i/>
+          <w:iCs/>
+        </w:rPr>
+      </w:pPr>
+      <w:r>
+        <w:rPr>
+          <w:i/>
+          <w:iCs/>
+        </w:rPr>
+        <w:t>-- INTERSECT: employees who have both been paid AND taken leave -- useful</w:t>
+      </w:r>
+    </w:p>
+    <w:p>
+      <w:pPr>
+        <w:spacing w:line="240" w:lineRule="auto"/>
+        <w:ind w:left="720"/>
+        <w:rPr>
+          <w:i/>
+          <w:iCs/>
+        </w:rPr>
+      </w:pPr>
+      <w:r>
+        <w:rPr>
+          <w:i/>
+          <w:iCs/>
+        </w:rPr>
+        <w:t>-- for auditing whether leave was properly reflected in a payroll cycle.</w:t>
+      </w:r>
+    </w:p>
+    <w:p>
+      <w:pPr>
+        <w:spacing w:line="240" w:lineRule="auto"/>
+        <w:ind w:left="720"/>
+        <w:rPr>
+          <w:i/>
+          <w:iCs/>
+        </w:rPr>
+      </w:pPr>
+    </w:p>
+    <w:p>
+      <w:pPr>
+        <w:spacing w:line="240" w:lineRule="auto"/>
+        <w:ind w:left="720"/>
+        <w:rPr>
+          <w:i/>
+          <w:iCs/>
+        </w:rPr>
+      </w:pPr>
+      <w:r>
+        <w:rPr>
+          <w:i/>
+          <w:iCs/>
+        </w:rPr>
+        <w:t xml:space="preserve">SELECT </w:t>
+      </w:r>
+      <w:proofErr w:type="spellStart"/>
+      <w:r>
+        <w:rPr>
+          <w:i/>
+          <w:iCs/>
+        </w:rPr>
+        <w:t>emp_id</w:t>
+      </w:r>
+      <w:proofErr w:type="spellEnd"/>
+      <w:r>
+        <w:rPr>
+          <w:i/>
+          <w:iCs/>
+        </w:rPr>
+        <w:t xml:space="preserve"> FROM PAYROLL</w:t>
+      </w:r>
+    </w:p>
+    <w:p>
+      <w:pPr>
+        <w:spacing w:line="240" w:lineRule="auto"/>
+        <w:ind w:left="720"/>
+        <w:rPr>
+          <w:i/>
+          <w:iCs/>
+        </w:rPr>
+      </w:pPr>
+      <w:r>
+        <w:rPr>
+          <w:i/>
+          <w:iCs/>
+        </w:rPr>
+        <w:t>INTERSECT</w:t>
+      </w:r>
+    </w:p>
+    <w:p>
+      <w:pPr>
+        <w:spacing w:line="240" w:lineRule="auto"/>
+        <w:ind w:left="720"/>
+        <w:rPr>
+          <w:i/>
+          <w:iCs/>
+        </w:rPr>
+      </w:pPr>
+      <w:r>
+        <w:rPr>
+          <w:i/>
+          <w:iCs/>
+        </w:rPr>
+        <w:t xml:space="preserve">SELECT </w:t>
+      </w:r>
+      <w:proofErr w:type="spellStart"/>
+      <w:r>
+        <w:rPr>
+          <w:i/>
+          <w:iCs/>
+        </w:rPr>
+        <w:t>emp_id</w:t>
+      </w:r>
+      <w:proofErr w:type="spellEnd"/>
+      <w:r>
+        <w:rPr>
+          <w:i/>
+          <w:iCs/>
+        </w:rPr>
+        <w:t xml:space="preserve"> FROM LEAVEE;</w:t>
+      </w:r>
+    </w:p>
+    <w:p>
+      <w:pPr>
+        <w:spacing w:line="240" w:lineRule="auto"/>
+        <w:ind w:left="720"/>
+        <w:rPr>
+          <w:i/>
+          <w:iCs/>
+        </w:rPr>
+      </w:pPr>
+    </w:p>
+    <w:p>
+      <w:pPr>
+        <w:spacing w:line="240" w:lineRule="auto"/>
+        <w:ind w:left="720"/>
+        <w:rPr>
+          <w:i/>
+          <w:iCs/>
+        </w:rPr>
+      </w:pPr>
+      <w:r>
+        <w:rPr>
+          <w:i/>
+          <w:iCs/>
+        </w:rPr>
+        <w:t>-- MINUS: employees who were paid but have no leave record on file -- the</w:t>
+      </w:r>
+    </w:p>
+    <w:p>
+      <w:pPr>
+        <w:spacing w:line="240" w:lineRule="auto"/>
+        <w:ind w:left="720"/>
+        <w:rPr>
+          <w:i/>
+          <w:iCs/>
+        </w:rPr>
+      </w:pPr>
+      <w:r>
+        <w:rPr>
+          <w:i/>
+          <w:iCs/>
+        </w:rPr>
+        <w:t>-- normal case for staff who haven't taken time off yet.</w:t>
+      </w:r>
+    </w:p>
+    <w:p>
+      <w:pPr>
+        <w:spacing w:line="240" w:lineRule="auto"/>
+        <w:ind w:left="720"/>
+        <w:rPr>
+          <w:i/>
+          <w:iCs/>
+        </w:rPr>
+      </w:pPr>
+    </w:p>
+    <w:p>
+      <w:pPr>
+        <w:spacing w:line="240" w:lineRule="auto"/>
+        <w:ind w:left="720"/>
+        <w:rPr>
+          <w:i/>
+          <w:iCs/>
+        </w:rPr>
+      </w:pPr>
+      <w:r>
+        <w:rPr>
+          <w:i/>
+          <w:iCs/>
+        </w:rPr>
+        <w:t xml:space="preserve">SELECT </w:t>
+      </w:r>
+      <w:proofErr w:type="spellStart"/>
+      <w:r>
+        <w:rPr>
+          <w:i/>
+          <w:iCs/>
+        </w:rPr>
+        <w:t>emp_id</w:t>
+      </w:r>
+      <w:proofErr w:type="spellEnd"/>
+      <w:r>
+        <w:rPr>
+          <w:i/>
+          <w:iCs/>
+        </w:rPr>
+        <w:t xml:space="preserve"> FROM PAYROLL</w:t>
+      </w:r>
+    </w:p>
+    <w:p>
+      <w:pPr>
+        <w:spacing w:line="240" w:lineRule="auto"/>
+        <w:ind w:left="720"/>
+        <w:rPr>
+          <w:i/>
+          <w:iCs/>
+        </w:rPr>
+      </w:pPr>
+      <w:r>
+        <w:rPr>
+          <w:i/>
+          <w:iCs/>
+        </w:rPr>
+        <w:t>MINUS</w:t>
+      </w:r>
+    </w:p>
+    <w:p>
+      <w:pPr>
+        <w:spacing w:line="240" w:lineRule="auto"/>
+        <w:ind w:left="720"/>
+        <w:rPr>
+          <w:i/>
+          <w:iCs/>
+        </w:rPr>
+      </w:pPr>
+      <w:r>
+        <w:rPr>
+          <w:i/>
+          <w:iCs/>
+        </w:rPr>
+        <w:t xml:space="preserve">SELECT </w:t>
+      </w:r>
+      <w:proofErr w:type="spellStart"/>
+      <w:r>
+        <w:rPr>
+          <w:i/>
+          <w:iCs/>
+        </w:rPr>
+        <w:t>emp_id</w:t>
+      </w:r>
+      <w:proofErr w:type="spellEnd"/>
+      <w:r>
+        <w:rPr>
+          <w:i/>
+          <w:iCs/>
+        </w:rPr>
+        <w:t xml:space="preserve"> FROM LEAVEE;</w:t>
+      </w:r>
+    </w:p>
+    <w:p>
+      <w:pPr>
+        <w:spacing w:line="240" w:lineRule="auto"/>
+        <w:ind w:left="720"/>
+        <w:rPr>
+          <w:i/>
+          <w:iCs/>
+        </w:rPr>
+      </w:pPr>
+    </w:p>
+    <w:p>
+      <w:pPr>
+        <w:spacing w:line="240" w:lineRule="auto"/>
+        <w:ind w:left="720"/>
+        <w:rPr>
+          <w:i/>
+          <w:iCs/>
+        </w:rPr>
+      </w:pPr>
+    </w:p>
+    <w:p>
+      <w:pPr>
+        <w:spacing w:line="240" w:lineRule="auto"/>
+        <w:ind w:left="720"/>
+        <w:rPr>
+          <w:i/>
+          <w:iCs/>
+        </w:rPr>
+      </w:pPr>
+    </w:p>
+    <w:p>
+      <w:pPr>
+        <w:spacing w:line="240" w:lineRule="auto"/>
+        <w:ind w:left="720"/>
+        <w:rPr>
+          <w:i/>
+          <w:iCs/>
+        </w:rPr>
+      </w:pPr>
+    </w:p>
+    <w:p>
+      <w:pPr>
+        <w:spacing w:line="240" w:lineRule="auto"/>
+        <w:ind w:left="720"/>
+        <w:rPr>
+          <w:i/>
+          <w:iCs/>
+        </w:rPr>
+      </w:pPr>
+    </w:p>
+    <w:p>
+      <w:pPr>
+        <w:spacing w:line="240" w:lineRule="auto"/>
+        <w:ind w:left="720"/>
+        <w:rPr>
+          <w:i/>
+          <w:iCs/>
+        </w:rPr>
+      </w:pPr>
+    </w:p>
+    <w:p>
+      <w:pPr>
+        <w:spacing w:line="240" w:lineRule="auto"/>
+      </w:pPr>
+      <w:r>
+        <w:lastRenderedPageBreak/>
+        <w:drawing>
+          <wp:inline distT="0" distB="0" distL="0" distR="0" wp14:anchorId="5C715899" wp14:editId="3E5AF677">
+            <wp:extent cx="5836920" cy="7200265"/>
+            <wp:effectExtent l="76200" t="76200" r="125730" b="133985"/>
+            <wp:docPr id="651912396" name="Picture 1"/>
+            <wp:cNvGraphicFramePr>
+              <a:graphicFrameLocks xmlns:a="http://schemas.openxmlformats.org/drawingml/2006/main" noChangeAspect="1"/>
+            </wp:cNvGraphicFramePr>
+            <a:graphic xmlns:a="http://schemas.openxmlformats.org/drawingml/2006/main">
+              <a:graphicData uri="http://schemas.openxmlformats.org/drawingml/2006/picture">
+                <pic:pic xmlns:pic="http://schemas.openxmlformats.org/drawingml/2006/picture">
+                  <pic:nvPicPr>
+                    <pic:cNvPr id="651912396" name=""/>
+                    <pic:cNvPicPr/>
+                  </pic:nvPicPr>
+                  <pic:blipFill>
+                    <a:blip r:embed="rId36"/>
+                    <a:stretch>
+                      <a:fillRect/>
+                    </a:stretch>
+                  </pic:blipFill>
+                  <pic:spPr>
+                    <a:xfrm>
+                      <a:off x="0" y="0"/>
+                      <a:ext cx="5836920" cy="7200265"/>
+                    </a:xfrm>
+                    <a:prstGeom prst="rect">
+                      <a:avLst/>
+                    </a:prstGeom>
+                    <a:ln w="38100" cap="sq">
+                      <a:solidFill>
+                        <a:srgbClr val="000000"/>
+                      </a:solidFill>
+                      <a:prstDash val="solid"/>
+                      <a:miter lim="800000"/>
+                    </a:ln>
+                    <a:effectLst>
+                      <a:outerShdw blurRad="50800" dist="38100" dir="2700000" algn="tl" rotWithShape="0">
+                        <a:srgbClr val="000000">
+                          <a:alpha val="43000"/>
+                        </a:srgbClr>
+                      </a:outerShdw>
+                    </a:effectLst>
+                  </pic:spPr>
+                </pic:pic>
+              </a:graphicData>
+            </a:graphic>
+          </wp:inline>
+        </w:drawing>
+      </w:r>
+    </w:p>
+    <w:p>
+      <w:pPr>
+        <w:spacing w:line="240" w:lineRule="auto"/>
+      </w:pPr>
+    </w:p>
+    <w:p>
+      <w:pPr>
+        <w:spacing w:line="240" w:lineRule="auto"/>
+      </w:pPr>
+    </w:p>
+    <w:p>
+      <w:pPr>
+        <w:spacing w:line="240" w:lineRule="auto"/>
       </w:pPr>
     </w:p>
     <w:sectPr>
@@ -17013,6 +17787,95 @@
     </w:lvl>
   </w:abstractNum>
   <w:abstractNum w:abstractNumId="1" w15:restartNumberingAfterBreak="0">
+    <w:nsid w:val="3C0265A7"/>
+    <w:multiLevelType w:val="hybridMultilevel"/>
+    <w:tmpl w:val="C62ABCC6"/>
+    <w:lvl w:ilvl="0" w:tplc="108E83EE">
+      <w:start w:val="1"/>
+      <w:numFmt w:val="lowerLetter"/>
+      <w:lvlText w:val="(%1)"/>
+      <w:lvlJc w:val="left"/>
+      <w:pPr>
+        <w:ind w:left="720" w:hanging="360"/>
+      </w:pPr>
+      <w:rPr>
+        <w:rFonts w:hint="default"/>
+      </w:rPr>
+    </w:lvl>
+    <w:lvl w:ilvl="1" w:tplc="04090019" w:tentative="1">
+      <w:start w:val="1"/>
+      <w:numFmt w:val="lowerLetter"/>
+      <w:lvlText w:val="%2."/>
+      <w:lvlJc w:val="left"/>
+      <w:pPr>
+        <w:ind w:left="1440" w:hanging="360"/>
+      </w:pPr>
+    </w:lvl>
+    <w:lvl w:ilvl="2" w:tplc="0409001B" w:tentative="1">
+      <w:start w:val="1"/>
+      <w:numFmt w:val="lowerRoman"/>
+      <w:lvlText w:val="%3."/>
+      <w:lvlJc w:val="right"/>
+      <w:pPr>
+        <w:ind w:left="2160" w:hanging="180"/>
+      </w:pPr>
+    </w:lvl>
+    <w:lvl w:ilvl="3" w:tplc="0409000F" w:tentative="1">
+      <w:start w:val="1"/>
+      <w:numFmt w:val="decimal"/>
+      <w:lvlText w:val="%4."/>
+      <w:lvlJc w:val="left"/>
+      <w:pPr>
+        <w:ind w:left="2880" w:hanging="360"/>
+      </w:pPr>
+    </w:lvl>
+    <w:lvl w:ilvl="4" w:tplc="04090019" w:tentative="1">
+      <w:start w:val="1"/>
+      <w:numFmt w:val="lowerLetter"/>
+      <w:lvlText w:val="%5."/>
+      <w:lvlJc w:val="left"/>
+      <w:pPr>
+        <w:ind w:left="3600" w:hanging="360"/>
+      </w:pPr>
+    </w:lvl>
+    <w:lvl w:ilvl="5" w:tplc="0409001B" w:tentative="1">
+      <w:start w:val="1"/>
+      <w:numFmt w:val="lowerRoman"/>
+      <w:lvlText w:val="%6."/>
+      <w:lvlJc w:val="right"/>
+      <w:pPr>
+        <w:ind w:left="4320" w:hanging="180"/>
+      </w:pPr>
+    </w:lvl>
+    <w:lvl w:ilvl="6" w:tplc="0409000F" w:tentative="1">
+      <w:start w:val="1"/>
+      <w:numFmt w:val="decimal"/>
+      <w:lvlText w:val="%7."/>
+      <w:lvlJc w:val="left"/>
+      <w:pPr>
+        <w:ind w:left="5040" w:hanging="360"/>
+      </w:pPr>
+    </w:lvl>
+    <w:lvl w:ilvl="7" w:tplc="04090019" w:tentative="1">
+      <w:start w:val="1"/>
+      <w:numFmt w:val="lowerLetter"/>
+      <w:lvlText w:val="%8."/>
+      <w:lvlJc w:val="left"/>
+      <w:pPr>
+        <w:ind w:left="5760" w:hanging="360"/>
+      </w:pPr>
+    </w:lvl>
+    <w:lvl w:ilvl="8" w:tplc="0409001B" w:tentative="1">
+      <w:start w:val="1"/>
+      <w:numFmt w:val="lowerRoman"/>
+      <w:lvlText w:val="%9."/>
+      <w:lvlJc w:val="right"/>
+      <w:pPr>
+        <w:ind w:left="6480" w:hanging="180"/>
+      </w:pPr>
+    </w:lvl>
+  </w:abstractNum>
+  <w:abstractNum w:abstractNumId="2" w15:restartNumberingAfterBreak="0">
     <w:nsid w:val="413130D2"/>
     <w:multiLevelType w:val="hybridMultilevel"/>
     <w:tmpl w:val="8E720F9E"/>
@@ -17125,7 +17988,7 @@
       </w:rPr>
     </w:lvl>
   </w:abstractNum>
-  <w:abstractNum w:abstractNumId="2" w15:restartNumberingAfterBreak="0">
+  <w:abstractNum w:abstractNumId="3" w15:restartNumberingAfterBreak="0">
     <w:nsid w:val="4E6D7B01"/>
     <w:multiLevelType w:val="hybridMultilevel"/>
     <w:tmpl w:val="787A6424"/>
@@ -17214,7 +18077,7 @@
       </w:pPr>
     </w:lvl>
   </w:abstractNum>
-  <w:abstractNum w:abstractNumId="3" w15:restartNumberingAfterBreak="0">
+  <w:abstractNum w:abstractNumId="4" w15:restartNumberingAfterBreak="0">
     <w:nsid w:val="57540C3B"/>
     <w:multiLevelType w:val="hybridMultilevel"/>
     <w:tmpl w:val="E98429B0"/>
@@ -17327,7 +18190,7 @@
       </w:rPr>
     </w:lvl>
   </w:abstractNum>
-  <w:abstractNum w:abstractNumId="4" w15:restartNumberingAfterBreak="0">
+  <w:abstractNum w:abstractNumId="5" w15:restartNumberingAfterBreak="0">
     <w:nsid w:val="6B240EB7"/>
     <w:multiLevelType w:val="hybridMultilevel"/>
     <w:tmpl w:val="F8209FA6"/>
@@ -17440,7 +18303,7 @@
       </w:rPr>
     </w:lvl>
   </w:abstractNum>
-  <w:abstractNum w:abstractNumId="5" w15:restartNumberingAfterBreak="0">
+  <w:abstractNum w:abstractNumId="6" w15:restartNumberingAfterBreak="0">
     <w:nsid w:val="70BD443C"/>
     <w:multiLevelType w:val="hybridMultilevel"/>
     <w:tmpl w:val="DF86C70E"/>
@@ -17553,7 +18416,7 @@
       </w:rPr>
     </w:lvl>
   </w:abstractNum>
-  <w:abstractNum w:abstractNumId="6" w15:restartNumberingAfterBreak="0">
+  <w:abstractNum w:abstractNumId="7" w15:restartNumberingAfterBreak="0">
     <w:nsid w:val="78547B2F"/>
     <w:multiLevelType w:val="hybridMultilevel"/>
     <w:tmpl w:val="2424F484"/>
@@ -17666,7 +18529,7 @@
       </w:rPr>
     </w:lvl>
   </w:abstractNum>
-  <w:abstractNum w:abstractNumId="7" w15:restartNumberingAfterBreak="0">
+  <w:abstractNum w:abstractNumId="8" w15:restartNumberingAfterBreak="0">
     <w:nsid w:val="7EC63488"/>
     <w:multiLevelType w:val="hybridMultilevel"/>
     <w:tmpl w:val="5606AFA0"/>
@@ -17783,25 +18646,28 @@
     <w:abstractNumId w:val="0"/>
   </w:num>
   <w:num w:numId="2" w16cid:durableId="2049330150">
+    <w:abstractNumId w:val="7"/>
+  </w:num>
+  <w:num w:numId="3" w16cid:durableId="386152582">
+    <w:abstractNumId w:val="4"/>
+  </w:num>
+  <w:num w:numId="4" w16cid:durableId="1123768739">
+    <w:abstractNumId w:val="5"/>
+  </w:num>
+  <w:num w:numId="5" w16cid:durableId="1600944875">
     <w:abstractNumId w:val="6"/>
   </w:num>
-  <w:num w:numId="3" w16cid:durableId="386152582">
+  <w:num w:numId="6" w16cid:durableId="326711551">
+    <w:abstractNumId w:val="8"/>
+  </w:num>
+  <w:num w:numId="7" w16cid:durableId="1854297197">
+    <w:abstractNumId w:val="2"/>
+  </w:num>
+  <w:num w:numId="8" w16cid:durableId="625237146">
     <w:abstractNumId w:val="3"/>
   </w:num>
-  <w:num w:numId="4" w16cid:durableId="1123768739">
-    <w:abstractNumId w:val="4"/>
-  </w:num>
-  <w:num w:numId="5" w16cid:durableId="1600944875">
-    <w:abstractNumId w:val="5"/>
-  </w:num>
-  <w:num w:numId="6" w16cid:durableId="326711551">
-    <w:abstractNumId w:val="7"/>
-  </w:num>
-  <w:num w:numId="7" w16cid:durableId="1854297197">
+  <w:num w:numId="9" w16cid:durableId="726414425">
     <w:abstractNumId w:val="1"/>
-  </w:num>
-  <w:num w:numId="8" w16cid:durableId="625237146">
-    <w:abstractNumId w:val="2"/>
   </w:num>
 </w:numbering>
 </file>

</xml_diff>

<commit_message>
Updated document er diagrams.
</commit_message>
<xml_diff>
--- a/Ems_FinalProject_86exyfme9/Submession.docx
+++ b/Ems_FinalProject_86exyfme9/Submession.docx
@@ -231,6 +231,17 @@
           <w:u w:val="single"/>
         </w:rPr>
         <w:t>Task1</w:t>
+      </w:r>
+      <w:r>
+        <w:rPr>
+          <w:rFonts w:asciiTheme="majorBidi" w:hAnsiTheme="majorBidi" w:cstheme="majorBidi"/>
+          <w:b/>
+          <w:bCs/>
+          <w:sz w:val="28"/>
+          <w:szCs w:val="28"/>
+          <w:u w:val="single"/>
+        </w:rPr>
+        <w:t xml:space="preserve"> </w:t>
       </w:r>
     </w:p>
     <w:p>
@@ -309,6 +320,358 @@
       <w:pPr>
         <w:rPr>
           <w:rFonts w:asciiTheme="majorBidi" w:hAnsiTheme="majorBidi" w:cstheme="majorBidi"/>
+          <w:i/>
+          <w:iCs/>
+        </w:rPr>
+      </w:pPr>
+      <w:r>
+        <w:rPr>
+          <w:rFonts w:asciiTheme="majorBidi" w:hAnsiTheme="majorBidi" w:cstheme="majorBidi"/>
+          <w:i/>
+          <w:iCs/>
+        </w:rPr>
+        <w:lastRenderedPageBreak/>
+        <w:tab/>
+        <w:t>--</w:t>
+      </w:r>
+      <w:r>
+        <w:rPr>
+          <w:rFonts w:asciiTheme="majorBidi" w:hAnsiTheme="majorBidi" w:cstheme="majorBidi"/>
+          <w:i/>
+          <w:iCs/>
+        </w:rPr>
+        <w:t xml:space="preserve">Sane diagram </w:t>
+      </w:r>
+      <w:r>
+        <w:rPr>
+          <w:rFonts w:asciiTheme="majorBidi" w:hAnsiTheme="majorBidi" w:cstheme="majorBidi"/>
+          <w:i/>
+          <w:iCs/>
+        </w:rPr>
+        <w:t>version #2</w:t>
+      </w:r>
+    </w:p>
+    <w:p>
+      <w:pPr>
+        <w:rPr>
+          <w:rFonts w:asciiTheme="majorBidi" w:hAnsiTheme="majorBidi" w:cstheme="majorBidi"/>
+          <w:i/>
+          <w:iCs/>
+        </w:rPr>
+      </w:pPr>
+      <w:r>
+        <w:rPr>
+          <w:rFonts w:asciiTheme="majorBidi" w:hAnsiTheme="majorBidi" w:cstheme="majorBidi"/>
+          <w:i/>
+          <w:iCs/>
+        </w:rPr>
+        <w:drawing>
+          <wp:inline distT="0" distB="0" distL="0" distR="0" wp14:anchorId="38FDED2F" wp14:editId="294C0B63">
+            <wp:extent cx="5943600" cy="6920230"/>
+            <wp:effectExtent l="0" t="0" r="0" b="0"/>
+            <wp:docPr id="1906794055" name="Picture 1"/>
+            <wp:cNvGraphicFramePr>
+              <a:graphicFrameLocks xmlns:a="http://schemas.openxmlformats.org/drawingml/2006/main" noChangeAspect="1"/>
+            </wp:cNvGraphicFramePr>
+            <a:graphic xmlns:a="http://schemas.openxmlformats.org/drawingml/2006/main">
+              <a:graphicData uri="http://schemas.openxmlformats.org/drawingml/2006/picture">
+                <pic:pic xmlns:pic="http://schemas.openxmlformats.org/drawingml/2006/picture">
+                  <pic:nvPicPr>
+                    <pic:cNvPr id="1906794055" name=""/>
+                    <pic:cNvPicPr/>
+                  </pic:nvPicPr>
+                  <pic:blipFill>
+                    <a:blip r:embed="rId9"/>
+                    <a:stretch>
+                      <a:fillRect/>
+                    </a:stretch>
+                  </pic:blipFill>
+                  <pic:spPr>
+                    <a:xfrm>
+                      <a:off x="0" y="0"/>
+                      <a:ext cx="5943600" cy="6920230"/>
+                    </a:xfrm>
+                    <a:prstGeom prst="rect">
+                      <a:avLst/>
+                    </a:prstGeom>
+                  </pic:spPr>
+                </pic:pic>
+              </a:graphicData>
+            </a:graphic>
+          </wp:inline>
+        </w:drawing>
+      </w:r>
+    </w:p>
+    <w:p>
+      <w:pPr>
+        <w:rPr>
+          <w:rFonts w:asciiTheme="majorBidi" w:hAnsiTheme="majorBidi" w:cstheme="majorBidi"/>
+          <w:i/>
+          <w:iCs/>
+        </w:rPr>
+      </w:pPr>
+    </w:p>
+    <w:p>
+      <w:pPr>
+        <w:rPr>
+          <w:rFonts w:asciiTheme="majorBidi" w:hAnsiTheme="majorBidi" w:cstheme="majorBidi"/>
+          <w:i/>
+          <w:iCs/>
+        </w:rPr>
+      </w:pPr>
+    </w:p>
+    <w:p>
+      <w:pPr>
+        <w:rPr>
+          <w:rFonts w:asciiTheme="majorBidi" w:hAnsiTheme="majorBidi" w:cstheme="majorBidi"/>
+          <w:i/>
+          <w:iCs/>
+        </w:rPr>
+      </w:pPr>
+    </w:p>
+    <w:p>
+      <w:pPr>
+        <w:rPr>
+          <w:rFonts w:asciiTheme="majorBidi" w:hAnsiTheme="majorBidi" w:cstheme="majorBidi"/>
+          <w:i/>
+          <w:iCs/>
+        </w:rPr>
+      </w:pPr>
+      <w:r>
+        <w:rPr>
+          <w:rFonts w:asciiTheme="majorBidi" w:hAnsiTheme="majorBidi" w:cstheme="majorBidi"/>
+          <w:i/>
+          <w:iCs/>
+        </w:rPr>
+        <w:lastRenderedPageBreak/>
+        <w:tab/>
+        <w:t>--</w:t>
+      </w:r>
+      <w:r>
+        <w:rPr>
+          <w:rFonts w:asciiTheme="majorBidi" w:hAnsiTheme="majorBidi" w:cstheme="majorBidi"/>
+          <w:i/>
+          <w:iCs/>
+        </w:rPr>
+        <w:t xml:space="preserve">Sane diagram </w:t>
+      </w:r>
+      <w:r>
+        <w:rPr>
+          <w:rFonts w:asciiTheme="majorBidi" w:hAnsiTheme="majorBidi" w:cstheme="majorBidi"/>
+          <w:i/>
+          <w:iCs/>
+        </w:rPr>
+        <w:t>version #</w:t>
+      </w:r>
+      <w:r>
+        <w:rPr>
+          <w:rFonts w:asciiTheme="majorBidi" w:hAnsiTheme="majorBidi" w:cstheme="majorBidi"/>
+          <w:i/>
+          <w:iCs/>
+        </w:rPr>
+        <w:t>3</w:t>
+      </w:r>
+    </w:p>
+    <w:p>
+      <w:pPr>
+        <w:rPr>
+          <w:rFonts w:asciiTheme="majorBidi" w:hAnsiTheme="majorBidi" w:cstheme="majorBidi"/>
+          <w:i/>
+          <w:iCs/>
+        </w:rPr>
+      </w:pPr>
+      <w:r>
+        <w:rPr>
+          <w:rFonts w:asciiTheme="majorBidi" w:hAnsiTheme="majorBidi" w:cstheme="majorBidi"/>
+          <w:i/>
+          <w:iCs/>
+        </w:rPr>
+        <w:drawing>
+          <wp:inline distT="0" distB="0" distL="0" distR="0" wp14:anchorId="1ECAD297" wp14:editId="26DBAB55">
+            <wp:extent cx="5943600" cy="3317240"/>
+            <wp:effectExtent l="0" t="0" r="0" b="0"/>
+            <wp:docPr id="382190293" name="Picture 3"/>
+            <wp:cNvGraphicFramePr>
+              <a:graphicFrameLocks xmlns:a="http://schemas.openxmlformats.org/drawingml/2006/main" noChangeAspect="1"/>
+            </wp:cNvGraphicFramePr>
+            <a:graphic xmlns:a="http://schemas.openxmlformats.org/drawingml/2006/main">
+              <a:graphicData uri="http://schemas.openxmlformats.org/drawingml/2006/picture">
+                <pic:pic xmlns:pic="http://schemas.openxmlformats.org/drawingml/2006/picture">
+                  <pic:nvPicPr>
+                    <pic:cNvPr id="0" name="Picture 7"/>
+                    <pic:cNvPicPr>
+                      <a:picLocks noChangeAspect="1" noChangeArrowheads="1"/>
+                    </pic:cNvPicPr>
+                  </pic:nvPicPr>
+                  <pic:blipFill>
+                    <a:blip r:embed="rId10" cstate="print">
+                      <a:extLst>
+                        <a:ext uri="{28A0092B-C50C-407E-A947-70E740481C1C}">
+                          <a14:useLocalDpi xmlns:a14="http://schemas.microsoft.com/office/drawing/2010/main" val="0"/>
+                        </a:ext>
+                      </a:extLst>
+                    </a:blip>
+                    <a:srcRect/>
+                    <a:stretch>
+                      <a:fillRect/>
+                    </a:stretch>
+                  </pic:blipFill>
+                  <pic:spPr bwMode="auto">
+                    <a:xfrm>
+                      <a:off x="0" y="0"/>
+                      <a:ext cx="5943600" cy="3317240"/>
+                    </a:xfrm>
+                    <a:prstGeom prst="rect">
+                      <a:avLst/>
+                    </a:prstGeom>
+                    <a:noFill/>
+                    <a:ln>
+                      <a:noFill/>
+                    </a:ln>
+                  </pic:spPr>
+                </pic:pic>
+              </a:graphicData>
+            </a:graphic>
+          </wp:inline>
+        </w:drawing>
+      </w:r>
+    </w:p>
+    <w:p>
+      <w:pPr>
+        <w:rPr>
+          <w:rFonts w:asciiTheme="majorBidi" w:hAnsiTheme="majorBidi" w:cstheme="majorBidi"/>
+          <w:i/>
+          <w:iCs/>
+        </w:rPr>
+      </w:pPr>
+    </w:p>
+    <w:p>
+      <w:pPr>
+        <w:rPr>
+          <w:rFonts w:asciiTheme="majorBidi" w:hAnsiTheme="majorBidi" w:cstheme="majorBidi"/>
+          <w:i/>
+          <w:iCs/>
+        </w:rPr>
+      </w:pPr>
+    </w:p>
+    <w:p>
+      <w:pPr>
+        <w:rPr>
+          <w:rFonts w:asciiTheme="majorBidi" w:hAnsiTheme="majorBidi" w:cstheme="majorBidi"/>
+          <w:i/>
+          <w:iCs/>
+        </w:rPr>
+      </w:pPr>
+    </w:p>
+    <w:p>
+      <w:pPr>
+        <w:rPr>
+          <w:rFonts w:asciiTheme="majorBidi" w:hAnsiTheme="majorBidi" w:cstheme="majorBidi"/>
+          <w:i/>
+          <w:iCs/>
+        </w:rPr>
+      </w:pPr>
+    </w:p>
+    <w:p>
+      <w:pPr>
+        <w:rPr>
+          <w:rFonts w:asciiTheme="majorBidi" w:hAnsiTheme="majorBidi" w:cstheme="majorBidi"/>
+          <w:i/>
+          <w:iCs/>
+        </w:rPr>
+      </w:pPr>
+    </w:p>
+    <w:p>
+      <w:pPr>
+        <w:rPr>
+          <w:rFonts w:asciiTheme="majorBidi" w:hAnsiTheme="majorBidi" w:cstheme="majorBidi"/>
+          <w:i/>
+          <w:iCs/>
+        </w:rPr>
+      </w:pPr>
+    </w:p>
+    <w:p>
+      <w:pPr>
+        <w:rPr>
+          <w:rFonts w:asciiTheme="majorBidi" w:hAnsiTheme="majorBidi" w:cstheme="majorBidi"/>
+          <w:i/>
+          <w:iCs/>
+        </w:rPr>
+      </w:pPr>
+    </w:p>
+    <w:p>
+      <w:pPr>
+        <w:rPr>
+          <w:rFonts w:asciiTheme="majorBidi" w:hAnsiTheme="majorBidi" w:cstheme="majorBidi"/>
+          <w:i/>
+          <w:iCs/>
+        </w:rPr>
+      </w:pPr>
+    </w:p>
+    <w:p>
+      <w:pPr>
+        <w:rPr>
+          <w:rFonts w:asciiTheme="majorBidi" w:hAnsiTheme="majorBidi" w:cstheme="majorBidi"/>
+          <w:i/>
+          <w:iCs/>
+        </w:rPr>
+      </w:pPr>
+    </w:p>
+    <w:p>
+      <w:pPr>
+        <w:rPr>
+          <w:rFonts w:asciiTheme="majorBidi" w:hAnsiTheme="majorBidi" w:cstheme="majorBidi"/>
+          <w:i/>
+          <w:iCs/>
+        </w:rPr>
+      </w:pPr>
+    </w:p>
+    <w:p>
+      <w:pPr>
+        <w:rPr>
+          <w:rFonts w:asciiTheme="majorBidi" w:hAnsiTheme="majorBidi" w:cstheme="majorBidi"/>
+          <w:i/>
+          <w:iCs/>
+        </w:rPr>
+      </w:pPr>
+    </w:p>
+    <w:p>
+      <w:pPr>
+        <w:rPr>
+          <w:rFonts w:asciiTheme="majorBidi" w:hAnsiTheme="majorBidi" w:cstheme="majorBidi"/>
+          <w:i/>
+          <w:iCs/>
+        </w:rPr>
+      </w:pPr>
+    </w:p>
+    <w:p>
+      <w:pPr>
+        <w:rPr>
+          <w:rFonts w:asciiTheme="majorBidi" w:hAnsiTheme="majorBidi" w:cstheme="majorBidi"/>
+          <w:b/>
+          <w:bCs/>
+          <w:sz w:val="28"/>
+          <w:szCs w:val="28"/>
+          <w:u w:val="single"/>
+        </w:rPr>
+      </w:pPr>
+    </w:p>
+    <w:p>
+      <w:pPr>
+        <w:rPr>
+          <w:rFonts w:asciiTheme="majorBidi" w:hAnsiTheme="majorBidi" w:cstheme="majorBidi"/>
+          <w:b/>
+          <w:bCs/>
+          <w:sz w:val="28"/>
+          <w:szCs w:val="28"/>
+          <w:u w:val="single"/>
+        </w:rPr>
+      </w:pPr>
+    </w:p>
+    <w:p>
+      <w:pPr>
+        <w:rPr>
+          <w:rFonts w:asciiTheme="majorBidi" w:hAnsiTheme="majorBidi" w:cstheme="majorBidi"/>
           <w:b/>
           <w:bCs/>
           <w:sz w:val="28"/>
@@ -12897,7 +13260,7 @@
                     <pic:cNvPicPr/>
                   </pic:nvPicPr>
                   <pic:blipFill>
-                    <a:blip r:embed="rId9"/>
+                    <a:blip r:embed="rId11"/>
                     <a:stretch>
                       <a:fillRect/>
                     </a:stretch>
@@ -12998,7 +13361,7 @@
                     <pic:cNvPicPr/>
                   </pic:nvPicPr>
                   <pic:blipFill>
-                    <a:blip r:embed="rId10"/>
+                    <a:blip r:embed="rId12"/>
                     <a:stretch>
                       <a:fillRect/>
                     </a:stretch>
@@ -13096,7 +13459,7 @@
                     <pic:cNvPicPr/>
                   </pic:nvPicPr>
                   <pic:blipFill>
-                    <a:blip r:embed="rId11"/>
+                    <a:blip r:embed="rId13"/>
                     <a:stretch>
                       <a:fillRect/>
                     </a:stretch>
@@ -13197,7 +13560,7 @@
                     <pic:cNvPicPr/>
                   </pic:nvPicPr>
                   <pic:blipFill>
-                    <a:blip r:embed="rId12"/>
+                    <a:blip r:embed="rId14"/>
                     <a:stretch>
                       <a:fillRect/>
                     </a:stretch>
@@ -13289,7 +13652,7 @@
                     <pic:cNvPicPr/>
                   </pic:nvPicPr>
                   <pic:blipFill>
-                    <a:blip r:embed="rId13"/>
+                    <a:blip r:embed="rId15"/>
                     <a:stretch>
                       <a:fillRect/>
                     </a:stretch>
@@ -13381,7 +13744,7 @@
                     <pic:cNvPicPr/>
                   </pic:nvPicPr>
                   <pic:blipFill>
-                    <a:blip r:embed="rId14"/>
+                    <a:blip r:embed="rId16"/>
                     <a:stretch>
                       <a:fillRect/>
                     </a:stretch>
@@ -13475,7 +13838,7 @@
                     <pic:cNvPicPr/>
                   </pic:nvPicPr>
                   <pic:blipFill>
-                    <a:blip r:embed="rId15"/>
+                    <a:blip r:embed="rId17"/>
                     <a:stretch>
                       <a:fillRect/>
                     </a:stretch>
@@ -13568,7 +13931,7 @@
                     <pic:cNvPicPr/>
                   </pic:nvPicPr>
                   <pic:blipFill>
-                    <a:blip r:embed="rId16"/>
+                    <a:blip r:embed="rId18"/>
                     <a:stretch>
                       <a:fillRect/>
                     </a:stretch>
@@ -13928,7 +14291,7 @@
                     <pic:cNvPicPr/>
                   </pic:nvPicPr>
                   <pic:blipFill>
-                    <a:blip r:embed="rId17"/>
+                    <a:blip r:embed="rId19"/>
                     <a:stretch>
                       <a:fillRect/>
                     </a:stretch>
@@ -14304,7 +14667,7 @@
                     <pic:cNvPicPr/>
                   </pic:nvPicPr>
                   <pic:blipFill>
-                    <a:blip r:embed="rId18"/>
+                    <a:blip r:embed="rId20"/>
                     <a:stretch>
                       <a:fillRect/>
                     </a:stretch>
@@ -14559,7 +14922,7 @@
                     <pic:cNvPicPr/>
                   </pic:nvPicPr>
                   <pic:blipFill>
-                    <a:blip r:embed="rId19"/>
+                    <a:blip r:embed="rId21"/>
                     <a:stretch>
                       <a:fillRect/>
                     </a:stretch>
@@ -14843,7 +15206,7 @@
                     <pic:cNvPicPr/>
                   </pic:nvPicPr>
                   <pic:blipFill>
-                    <a:blip r:embed="rId20"/>
+                    <a:blip r:embed="rId22"/>
                     <a:stretch>
                       <a:fillRect/>
                     </a:stretch>
@@ -15419,7 +15782,7 @@
                     </pic:cNvPicPr>
                   </pic:nvPicPr>
                   <pic:blipFill>
-                    <a:blip r:embed="rId21">
+                    <a:blip r:embed="rId23">
                       <a:extLst>
                         <a:ext uri="{28A0092B-C50C-407E-A947-70E740481C1C}">
                           <a14:useLocalDpi xmlns:a14="http://schemas.microsoft.com/office/drawing/2010/main" val="0"/>
@@ -15926,7 +16289,7 @@
                     </pic:cNvPicPr>
                   </pic:nvPicPr>
                   <pic:blipFill>
-                    <a:blip r:embed="rId22">
+                    <a:blip r:embed="rId24">
                       <a:extLst>
                         <a:ext uri="{28A0092B-C50C-407E-A947-70E740481C1C}">
                           <a14:useLocalDpi xmlns:a14="http://schemas.microsoft.com/office/drawing/2010/main" val="0"/>
@@ -16021,7 +16384,7 @@
                     </pic:cNvPicPr>
                   </pic:nvPicPr>
                   <pic:blipFill>
-                    <a:blip r:embed="rId23">
+                    <a:blip r:embed="rId25">
                       <a:extLst>
                         <a:ext uri="{28A0092B-C50C-407E-A947-70E740481C1C}">
                           <a14:useLocalDpi xmlns:a14="http://schemas.microsoft.com/office/drawing/2010/main" val="0"/>
@@ -16282,7 +16645,7 @@
                     </pic:cNvPicPr>
                   </pic:nvPicPr>
                   <pic:blipFill rotWithShape="1">
-                    <a:blip r:embed="rId24">
+                    <a:blip r:embed="rId26">
                       <a:extLst>
                         <a:ext uri="{28A0092B-C50C-407E-A947-70E740481C1C}">
                           <a14:useLocalDpi xmlns:a14="http://schemas.microsoft.com/office/drawing/2010/main" val="0"/>
@@ -16449,7 +16812,7 @@
                     </pic:cNvPicPr>
                   </pic:nvPicPr>
                   <pic:blipFill rotWithShape="1">
-                    <a:blip r:embed="rId25">
+                    <a:blip r:embed="rId27">
                       <a:extLst>
                         <a:ext uri="{28A0092B-C50C-407E-A947-70E740481C1C}">
                           <a14:useLocalDpi xmlns:a14="http://schemas.microsoft.com/office/drawing/2010/main" val="0"/>
@@ -16581,7 +16944,7 @@
                     </pic:cNvPicPr>
                   </pic:nvPicPr>
                   <pic:blipFill>
-                    <a:blip r:embed="rId26">
+                    <a:blip r:embed="rId28">
                       <a:extLst>
                         <a:ext uri="{28A0092B-C50C-407E-A947-70E740481C1C}">
                           <a14:useLocalDpi xmlns:a14="http://schemas.microsoft.com/office/drawing/2010/main" val="0"/>
@@ -16716,7 +17079,7 @@
                     <pic:cNvPicPr/>
                   </pic:nvPicPr>
                   <pic:blipFill rotWithShape="1">
-                    <a:blip r:embed="rId27"/>
+                    <a:blip r:embed="rId29"/>
                     <a:srcRect b="28232"/>
                     <a:stretch>
                       <a:fillRect/>
@@ -16896,7 +17259,7 @@
                     <pic:cNvPicPr/>
                   </pic:nvPicPr>
                   <pic:blipFill>
-                    <a:blip r:embed="rId28"/>
+                    <a:blip r:embed="rId30"/>
                     <a:stretch>
                       <a:fillRect/>
                     </a:stretch>
@@ -17124,7 +17487,7 @@
                     <pic:cNvPicPr/>
                   </pic:nvPicPr>
                   <pic:blipFill>
-                    <a:blip r:embed="rId29"/>
+                    <a:blip r:embed="rId31"/>
                     <a:stretch>
                       <a:fillRect/>
                     </a:stretch>
@@ -17283,7 +17646,7 @@
                     <pic:cNvPicPr/>
                   </pic:nvPicPr>
                   <pic:blipFill>
-                    <a:blip r:embed="rId30"/>
+                    <a:blip r:embed="rId32"/>
                     <a:stretch>
                       <a:fillRect/>
                     </a:stretch>
@@ -17878,7 +18241,7 @@
                     <pic:cNvPicPr/>
                   </pic:nvPicPr>
                   <pic:blipFill>
-                    <a:blip r:embed="rId31"/>
+                    <a:blip r:embed="rId33"/>
                     <a:stretch>
                       <a:fillRect/>
                     </a:stretch>
@@ -18234,7 +18597,7 @@
                     <pic:cNvPicPr/>
                   </pic:nvPicPr>
                   <pic:blipFill>
-                    <a:blip r:embed="rId32"/>
+                    <a:blip r:embed="rId34"/>
                     <a:stretch>
                       <a:fillRect/>
                     </a:stretch>
@@ -18699,7 +19062,7 @@
                     <pic:cNvPicPr/>
                   </pic:nvPicPr>
                   <pic:blipFill>
-                    <a:blip r:embed="rId33"/>
+                    <a:blip r:embed="rId35"/>
                     <a:stretch>
                       <a:fillRect/>
                     </a:stretch>
@@ -19072,7 +19435,7 @@
                     <pic:cNvPicPr/>
                   </pic:nvPicPr>
                   <pic:blipFill>
-                    <a:blip r:embed="rId34"/>
+                    <a:blip r:embed="rId36"/>
                     <a:stretch>
                       <a:fillRect/>
                     </a:stretch>
@@ -19441,7 +19804,7 @@
                     <pic:cNvPicPr/>
                   </pic:nvPicPr>
                   <pic:blipFill>
-                    <a:blip r:embed="rId35"/>
+                    <a:blip r:embed="rId37"/>
                     <a:stretch>
                       <a:fillRect/>
                     </a:stretch>
@@ -20189,7 +20552,7 @@
                     <pic:cNvPicPr/>
                   </pic:nvPicPr>
                   <pic:blipFill>
-                    <a:blip r:embed="rId36"/>
+                    <a:blip r:embed="rId38"/>
                     <a:stretch>
                       <a:fillRect/>
                     </a:stretch>
@@ -20813,7 +21176,7 @@
                     <pic:cNvPicPr/>
                   </pic:nvPicPr>
                   <pic:blipFill>
-                    <a:blip r:embed="rId37"/>
+                    <a:blip r:embed="rId39"/>
                     <a:stretch>
                       <a:fillRect/>
                     </a:stretch>
@@ -21268,7 +21631,7 @@
                     <pic:cNvPicPr/>
                   </pic:nvPicPr>
                   <pic:blipFill>
-                    <a:blip r:embed="rId38"/>
+                    <a:blip r:embed="rId40"/>
                     <a:stretch>
                       <a:fillRect/>
                     </a:stretch>
@@ -21817,7 +22180,7 @@
                     <pic:cNvPicPr/>
                   </pic:nvPicPr>
                   <pic:blipFill>
-                    <a:blip r:embed="rId39"/>
+                    <a:blip r:embed="rId41"/>
                     <a:stretch>
                       <a:fillRect/>
                     </a:stretch>
@@ -22536,7 +22899,7 @@
                     <pic:cNvPicPr/>
                   </pic:nvPicPr>
                   <pic:blipFill>
-                    <a:blip r:embed="rId40"/>
+                    <a:blip r:embed="rId42"/>
                     <a:stretch>
                       <a:fillRect/>
                     </a:stretch>
@@ -23134,7 +23497,7 @@
                     <pic:cNvPicPr/>
                   </pic:nvPicPr>
                   <pic:blipFill>
-                    <a:blip r:embed="rId41"/>
+                    <a:blip r:embed="rId43"/>
                     <a:stretch>
                       <a:fillRect/>
                     </a:stretch>
@@ -23605,7 +23968,7 @@
                     <pic:cNvPicPr/>
                   </pic:nvPicPr>
                   <pic:blipFill>
-                    <a:blip r:embed="rId42"/>
+                    <a:blip r:embed="rId44"/>
                     <a:stretch>
                       <a:fillRect/>
                     </a:stretch>
@@ -23834,7 +24197,7 @@
                     <pic:cNvPicPr/>
                   </pic:nvPicPr>
                   <pic:blipFill rotWithShape="1">
-                    <a:blip r:embed="rId43"/>
+                    <a:blip r:embed="rId45"/>
                     <a:srcRect t="8149" b="14646"/>
                     <a:stretch>
                       <a:fillRect/>
@@ -24043,7 +24406,7 @@
                     <pic:cNvPicPr/>
                   </pic:nvPicPr>
                   <pic:blipFill>
-                    <a:blip r:embed="rId44"/>
+                    <a:blip r:embed="rId46"/>
                     <a:stretch>
                       <a:fillRect/>
                     </a:stretch>
@@ -24123,7 +24486,7 @@
                     <pic:cNvPicPr/>
                   </pic:nvPicPr>
                   <pic:blipFill>
-                    <a:blip r:embed="rId45"/>
+                    <a:blip r:embed="rId47"/>
                     <a:stretch>
                       <a:fillRect/>
                     </a:stretch>
@@ -24238,7 +24601,7 @@
                     <pic:cNvPicPr/>
                   </pic:nvPicPr>
                   <pic:blipFill>
-                    <a:blip r:embed="rId46"/>
+                    <a:blip r:embed="rId48"/>
                     <a:stretch>
                       <a:fillRect/>
                     </a:stretch>
@@ -24430,7 +24793,7 @@
                     <pic:cNvPicPr/>
                   </pic:nvPicPr>
                   <pic:blipFill>
-                    <a:blip r:embed="rId47"/>
+                    <a:blip r:embed="rId49"/>
                     <a:stretch>
                       <a:fillRect/>
                     </a:stretch>
@@ -24625,7 +24988,7 @@
                     <pic:cNvPicPr/>
                   </pic:nvPicPr>
                   <pic:blipFill>
-                    <a:blip r:embed="rId48"/>
+                    <a:blip r:embed="rId50"/>
                     <a:stretch>
                       <a:fillRect/>
                     </a:stretch>
@@ -24898,7 +25261,7 @@
                     <pic:cNvPicPr/>
                   </pic:nvPicPr>
                   <pic:blipFill rotWithShape="1">
-                    <a:blip r:embed="rId49"/>
+                    <a:blip r:embed="rId51"/>
                     <a:srcRect r="18350" b="11393"/>
                     <a:stretch>
                       <a:fillRect/>
@@ -25490,7 +25853,7 @@
                     <pic:cNvPicPr/>
                   </pic:nvPicPr>
                   <pic:blipFill>
-                    <a:blip r:embed="rId50"/>
+                    <a:blip r:embed="rId52"/>
                     <a:stretch>
                       <a:fillRect/>
                     </a:stretch>
@@ -26073,7 +26436,7 @@
                     <pic:cNvPicPr/>
                   </pic:nvPicPr>
                   <pic:blipFill>
-                    <a:blip r:embed="rId51"/>
+                    <a:blip r:embed="rId53"/>
                     <a:stretch>
                       <a:fillRect/>
                     </a:stretch>
@@ -26681,7 +27044,7 @@
                     <pic:cNvPicPr/>
                   </pic:nvPicPr>
                   <pic:blipFill>
-                    <a:blip r:embed="rId52"/>
+                    <a:blip r:embed="rId54"/>
                     <a:stretch>
                       <a:fillRect/>
                     </a:stretch>
@@ -27186,7 +27549,7 @@
                     <pic:cNvPicPr/>
                   </pic:nvPicPr>
                   <pic:blipFill rotWithShape="1">
-                    <a:blip r:embed="rId53"/>
+                    <a:blip r:embed="rId55"/>
                     <a:srcRect r="21096" b="10805"/>
                     <a:stretch>
                       <a:fillRect/>
@@ -27841,7 +28204,7 @@
                     <pic:cNvPicPr/>
                   </pic:nvPicPr>
                   <pic:blipFill>
-                    <a:blip r:embed="rId54"/>
+                    <a:blip r:embed="rId56"/>
                     <a:stretch>
                       <a:fillRect/>
                     </a:stretch>
@@ -28428,7 +28791,7 @@
                     <pic:cNvPicPr/>
                   </pic:nvPicPr>
                   <pic:blipFill>
-                    <a:blip r:embed="rId55"/>
+                    <a:blip r:embed="rId57"/>
                     <a:stretch>
                       <a:fillRect/>
                     </a:stretch>
@@ -28883,7 +29246,7 @@
                     <pic:cNvPicPr/>
                   </pic:nvPicPr>
                   <pic:blipFill>
-                    <a:blip r:embed="rId56"/>
+                    <a:blip r:embed="rId58"/>
                     <a:stretch>
                       <a:fillRect/>
                     </a:stretch>
@@ -29312,7 +29675,7 @@
                     <pic:cNvPicPr/>
                   </pic:nvPicPr>
                   <pic:blipFill>
-                    <a:blip r:embed="rId57"/>
+                    <a:blip r:embed="rId59"/>
                     <a:stretch>
                       <a:fillRect/>
                     </a:stretch>
@@ -29775,7 +30138,7 @@
                     <pic:cNvPicPr/>
                   </pic:nvPicPr>
                   <pic:blipFill>
-                    <a:blip r:embed="rId58"/>
+                    <a:blip r:embed="rId60"/>
                     <a:stretch>
                       <a:fillRect/>
                     </a:stretch>
@@ -30142,7 +30505,7 @@
                     <pic:cNvPicPr/>
                   </pic:nvPicPr>
                   <pic:blipFill>
-                    <a:blip r:embed="rId59"/>
+                    <a:blip r:embed="rId61"/>
                     <a:stretch>
                       <a:fillRect/>
                     </a:stretch>
@@ -30662,7 +31025,7 @@
                     <pic:cNvPicPr/>
                   </pic:nvPicPr>
                   <pic:blipFill>
-                    <a:blip r:embed="rId60"/>
+                    <a:blip r:embed="rId62"/>
                     <a:stretch>
                       <a:fillRect/>
                     </a:stretch>
@@ -50558,6 +50921,7 @@
       </w:pPr>
     </w:p>
     <w:sectPr>
+      <w:footerReference w:type="default" r:id="rId63"/>
       <w:pgSz w:w="12240" w:h="15840"/>
       <w:pgMar w:top="1440" w:right="1440" w:bottom="1440" w:left="1440" w:header="720" w:footer="720" w:gutter="0"/>
       <w:pgBorders w:offsetFrom="page">
@@ -50596,6 +50960,122 @@
     </w:p>
   </w:endnote>
 </w:endnotes>
+</file>
+
+<file path=word/footer1.xml><?xml version="1.0" encoding="utf-8"?>
+<w:ftr xmlns:wpc="http://schemas.microsoft.com/office/word/2010/wordprocessingCanvas" xmlns:cx="http://schemas.microsoft.com/office/drawing/2014/chartex" xmlns:cx1="http://schemas.microsoft.com/office/drawing/2015/9/8/chartex" xmlns:cx2="http://schemas.microsoft.com/office/drawing/2015/10/21/chartex" xmlns:cx3="http://schemas.microsoft.com/office/drawing/2016/5/9/chartex" xmlns:cx4="http://schemas.microsoft.com/office/drawing/2016/5/10/chartex" xmlns:cx5="http://schemas.microsoft.com/office/drawing/2016/5/11/chartex" xmlns:cx6="http://schemas.microsoft.com/office/drawing/2016/5/12/chartex" xmlns:cx7="http://schemas.microsoft.com/office/drawing/2016/5/13/chartex" xmlns:cx8="http://schemas.microsoft.com/office/drawing/2016/5/14/chartex" xmlns:mc="http://schemas.openxmlformats.org/markup-compatibility/2006" xmlns:aink="http://schemas.microsoft.com/office/drawing/2016/ink" xmlns:am3d="http://schemas.microsoft.com/office/drawing/2017/model3d" xmlns:o="urn:schemas-microsoft-com:office:office" xmlns:oel="http://schemas.microsoft.com/office/2019/extlst" xmlns:r="http://schemas.openxmlformats.org/officeDocument/2006/relationships" xmlns:m="http://schemas.openxmlformats.org/officeDocument/2006/math" xmlns:v="urn:schemas-microsoft-com:vml" xmlns:wp14="http://schemas.microsoft.com/office/word/2010/wordprocessingDrawing" xmlns:wp="http://schemas.openxmlformats.org/drawingml/2006/wordprocessingDrawing" xmlns:w10="urn:schemas-microsoft-com:office:word" xmlns:w="http://schemas.openxmlformats.org/wordprocessingml/2006/main" xmlns:w14="http://schemas.microsoft.com/office/word/2010/wordml" xmlns:w15="http://schemas.microsoft.com/office/word/2012/wordml" xmlns:w16cex="http://schemas.microsoft.com/office/word/2018/wordml/cex" xmlns:w16cid="http://schemas.microsoft.com/office/word/2016/wordml/cid" xmlns:w16="http://schemas.microsoft.com/office/word/2018/wordml" xmlns:w16du="http://schemas.microsoft.com/office/word/2023/wordml/word16du" xmlns:w16sdtdh="http://schemas.microsoft.com/office/word/2020/wordml/sdtdatahash" xmlns:w16sdtfl="http://schemas.microsoft.com/office/word/2024/wordml/sdtformatlock" xmlns:w16se="http://schemas.microsoft.com/office/word/2015/wordml/symex" xmlns:wpg="http://schemas.microsoft.com/office/word/2010/wordprocessingGroup" xmlns:wpi="http://schemas.microsoft.com/office/word/2010/wordprocessingInk" xmlns:wne="http://schemas.microsoft.com/office/word/2006/wordml" xmlns:wps="http://schemas.microsoft.com/office/word/2010/wordprocessingShape" mc:Ignorable="w14 w15 w16se w16cid w16 w16cex w16sdtdh w16sdtfl w16du wp14">
+  <w:sdt>
+    <w:sdtPr>
+      <w:id w:val="-1289121963"/>
+      <w:docPartObj>
+        <w:docPartGallery w:val="Page Numbers (Bottom of Page)"/>
+        <w:docPartUnique/>
+      </w:docPartObj>
+    </w:sdtPr>
+    <w:sdtContent>
+      <w:sdt>
+        <w:sdtPr>
+          <w:id w:val="-1769616900"/>
+          <w:docPartObj>
+            <w:docPartGallery w:val="Page Numbers (Top of Page)"/>
+            <w:docPartUnique/>
+          </w:docPartObj>
+        </w:sdtPr>
+        <w:sdtContent>
+          <w:p>
+            <w:pPr>
+              <w:pStyle w:val="Footer"/>
+              <w:jc w:val="right"/>
+            </w:pPr>
+            <w:r>
+              <w:t xml:space="preserve">Page </w:t>
+            </w:r>
+            <w:r>
+              <w:rPr>
+                <w:b/>
+                <w:bCs/>
+              </w:rPr>
+              <w:fldChar w:fldCharType="begin"/>
+            </w:r>
+            <w:r>
+              <w:rPr>
+                <w:b/>
+                <w:bCs/>
+              </w:rPr>
+              <w:instrText xml:space="preserve"> PAGE </w:instrText>
+            </w:r>
+            <w:r>
+              <w:rPr>
+                <w:b/>
+                <w:bCs/>
+              </w:rPr>
+              <w:fldChar w:fldCharType="separate"/>
+            </w:r>
+            <w:r>
+              <w:rPr>
+                <w:b/>
+                <w:bCs/>
+                <w:noProof/>
+              </w:rPr>
+              <w:t>2</w:t>
+            </w:r>
+            <w:r>
+              <w:rPr>
+                <w:b/>
+                <w:bCs/>
+              </w:rPr>
+              <w:fldChar w:fldCharType="end"/>
+            </w:r>
+            <w:r>
+              <w:t xml:space="preserve"> of </w:t>
+            </w:r>
+            <w:r>
+              <w:rPr>
+                <w:b/>
+                <w:bCs/>
+              </w:rPr>
+              <w:fldChar w:fldCharType="begin"/>
+            </w:r>
+            <w:r>
+              <w:rPr>
+                <w:b/>
+                <w:bCs/>
+              </w:rPr>
+              <w:instrText xml:space="preserve"> NUMPAGES  </w:instrText>
+            </w:r>
+            <w:r>
+              <w:rPr>
+                <w:b/>
+                <w:bCs/>
+              </w:rPr>
+              <w:fldChar w:fldCharType="separate"/>
+            </w:r>
+            <w:r>
+              <w:rPr>
+                <w:b/>
+                <w:bCs/>
+                <w:noProof/>
+              </w:rPr>
+              <w:t>2</w:t>
+            </w:r>
+            <w:r>
+              <w:rPr>
+                <w:b/>
+                <w:bCs/>
+              </w:rPr>
+              <w:fldChar w:fldCharType="end"/>
+            </w:r>
+          </w:p>
+        </w:sdtContent>
+      </w:sdt>
+    </w:sdtContent>
+  </w:sdt>
+  <w:p>
+    <w:pPr>
+      <w:pStyle w:val="Footer"/>
+    </w:pPr>
+  </w:p>
+</w:ftr>
 </file>
 
 <file path=word/footnotes.xml><?xml version="1.0" encoding="utf-8"?>
@@ -52024,7 +52504,7 @@
   <w:style w:type="paragraph" w:default="1" w:styleId="Normal">
     <w:name w:val="Normal"/>
     <w:qFormat/>
-    <w:rsid w:val="002C63C9"/>
+    <w:rsid w:val="002616BB"/>
   </w:style>
   <w:style w:type="paragraph" w:styleId="Heading1">
     <w:name w:val="heading 1"/>

</xml_diff>